<commit_message>
Update KSA Royal Sky request letter
</commit_message>
<xml_diff>
--- a/templates/ROYAL/KSA/request_letter.docx
+++ b/templates/ROYAL/KSA/request_letter.docx
@@ -9,6 +9,8 @@
         <w:spacing w:after="164" w:line="220" w:lineRule="exact"/>
         <w:rPr>
           <w:rFonts w:asciiTheme="majorBidi" w:hAnsiTheme="majorBidi" w:cstheme="majorBidi"/>
+          <w:sz w:val="20"/>
+          <w:szCs w:val="20"/>
         </w:rPr>
       </w:pPr>
     </w:p>
@@ -20,6 +22,8 @@
         <w:jc w:val="center"/>
         <w:rPr>
           <w:rFonts w:asciiTheme="majorBidi" w:hAnsiTheme="majorBidi" w:cstheme="majorBidi"/>
+          <w:sz w:val="20"/>
+          <w:szCs w:val="20"/>
         </w:rPr>
       </w:pPr>
       <w:r>
@@ -27,7 +31,7 @@
           <w:rFonts w:asciiTheme="majorBidi" w:eastAsia="Calibri" w:hAnsiTheme="majorBidi" w:cstheme="majorBidi"/>
           <w:b/>
           <w:color w:val="000000"/>
-          <w:sz w:val="24"/>
+          <w:szCs w:val="20"/>
           <w:u w:val="single"/>
         </w:rPr>
         <w:t>Request letter to Indian Mission for Foreign Employer (FE) Registration</w:t>
@@ -37,7 +41,7 @@
           <w:rFonts w:asciiTheme="majorBidi" w:eastAsia="Calibri" w:hAnsiTheme="majorBidi" w:cstheme="majorBidi"/>
           <w:b/>
           <w:color w:val="000000"/>
-          <w:sz w:val="24"/>
+          <w:szCs w:val="20"/>
         </w:rPr>
         <w:t xml:space="preserve"> </w:t>
       </w:r>
@@ -50,6 +54,8 @@
         <w:jc w:val="center"/>
         <w:rPr>
           <w:rFonts w:asciiTheme="majorBidi" w:hAnsiTheme="majorBidi" w:cstheme="majorBidi"/>
+          <w:sz w:val="20"/>
+          <w:szCs w:val="20"/>
         </w:rPr>
       </w:pPr>
       <w:r>
@@ -57,6 +63,8 @@
           <w:rFonts w:asciiTheme="majorBidi" w:eastAsia="Calibri" w:hAnsiTheme="majorBidi" w:cstheme="majorBidi"/>
           <w:i/>
           <w:color w:val="000000"/>
+          <w:sz w:val="20"/>
+          <w:szCs w:val="20"/>
         </w:rPr>
         <w:t xml:space="preserve">(For Individual Employers (i.e. Individual person), desiring to employ Indian workers for domestic </w:t>
       </w:r>
@@ -69,6 +77,8 @@
         <w:jc w:val="center"/>
         <w:rPr>
           <w:rFonts w:asciiTheme="majorBidi" w:hAnsiTheme="majorBidi" w:cstheme="majorBidi"/>
+          <w:sz w:val="20"/>
+          <w:szCs w:val="20"/>
         </w:rPr>
       </w:pPr>
       <w:r>
@@ -76,6 +86,8 @@
           <w:rFonts w:asciiTheme="majorBidi" w:eastAsia="Calibri" w:hAnsiTheme="majorBidi" w:cstheme="majorBidi"/>
           <w:i/>
           <w:color w:val="000000"/>
+          <w:sz w:val="20"/>
+          <w:szCs w:val="20"/>
         </w:rPr>
         <w:t xml:space="preserve">works. To be filled by the Employer himself/herself in his/ her own handwriting in English Language </w:t>
       </w:r>
@@ -88,6 +100,8 @@
         <w:jc w:val="center"/>
         <w:rPr>
           <w:rFonts w:asciiTheme="majorBidi" w:hAnsiTheme="majorBidi" w:cstheme="majorBidi"/>
+          <w:sz w:val="20"/>
+          <w:szCs w:val="20"/>
         </w:rPr>
       </w:pPr>
       <w:r>
@@ -95,6 +109,8 @@
           <w:rFonts w:asciiTheme="majorBidi" w:eastAsia="Calibri" w:hAnsiTheme="majorBidi" w:cstheme="majorBidi"/>
           <w:i/>
           <w:color w:val="000000"/>
+          <w:sz w:val="20"/>
+          <w:szCs w:val="20"/>
         </w:rPr>
         <w:t xml:space="preserve">and uploaded online along with the supporting document at the time applying online through </w:t>
       </w:r>
@@ -107,6 +123,8 @@
         <w:jc w:val="center"/>
         <w:rPr>
           <w:rFonts w:asciiTheme="majorBidi" w:hAnsiTheme="majorBidi" w:cstheme="majorBidi"/>
+          <w:sz w:val="20"/>
+          <w:szCs w:val="20"/>
         </w:rPr>
       </w:pPr>
       <w:proofErr w:type="spellStart"/>
@@ -115,6 +133,8 @@
           <w:rFonts w:asciiTheme="majorBidi" w:eastAsia="Calibri" w:hAnsiTheme="majorBidi" w:cstheme="majorBidi"/>
           <w:i/>
           <w:color w:val="000000"/>
+          <w:sz w:val="20"/>
+          <w:szCs w:val="20"/>
         </w:rPr>
         <w:t>eMigrate</w:t>
       </w:r>
@@ -124,6 +144,8 @@
           <w:rFonts w:asciiTheme="majorBidi" w:eastAsia="Calibri" w:hAnsiTheme="majorBidi" w:cstheme="majorBidi"/>
           <w:i/>
           <w:color w:val="000000"/>
+          <w:sz w:val="20"/>
+          <w:szCs w:val="20"/>
         </w:rPr>
         <w:t xml:space="preserve"> System. </w:t>
       </w:r>
@@ -140,11 +162,15 @@
         <w:ind w:right="-1289"/>
         <w:rPr>
           <w:rFonts w:asciiTheme="majorBidi" w:hAnsiTheme="majorBidi" w:cstheme="majorBidi"/>
+          <w:sz w:val="20"/>
+          <w:szCs w:val="20"/>
         </w:rPr>
       </w:pPr>
       <w:r>
         <w:rPr>
           <w:rFonts w:asciiTheme="majorBidi" w:hAnsiTheme="majorBidi" w:cstheme="majorBidi"/>
+          <w:sz w:val="20"/>
+          <w:szCs w:val="20"/>
         </w:rPr>
         <w:tab/>
       </w:r>
@@ -161,12 +187,16 @@
         <w:ind w:right="-992"/>
         <w:rPr>
           <w:rFonts w:asciiTheme="majorBidi" w:hAnsiTheme="majorBidi" w:cstheme="majorBidi"/>
+          <w:sz w:val="20"/>
+          <w:szCs w:val="20"/>
         </w:rPr>
       </w:pPr>
       <w:r>
         <w:rPr>
           <w:rFonts w:asciiTheme="majorBidi" w:hAnsiTheme="majorBidi" w:cstheme="majorBidi"/>
           <w:noProof/>
+          <w:sz w:val="20"/>
+          <w:szCs w:val="20"/>
         </w:rPr>
         <mc:AlternateContent>
           <mc:Choice Requires="wps">
@@ -417,6 +447,8 @@
         <w:rPr>
           <w:rFonts w:asciiTheme="majorBidi" w:hAnsiTheme="majorBidi" w:cstheme="majorBidi"/>
           <w:noProof/>
+          <w:sz w:val="20"/>
+          <w:szCs w:val="20"/>
         </w:rPr>
         <mc:AlternateContent>
           <mc:Choice Requires="wps">
@@ -520,6 +552,8 @@
       <w:r>
         <w:rPr>
           <w:rFonts w:asciiTheme="majorBidi" w:hAnsiTheme="majorBidi" w:cstheme="majorBidi"/>
+          <w:sz w:val="20"/>
+          <w:szCs w:val="20"/>
         </w:rPr>
         <w:br/>
       </w:r>
@@ -527,7 +561,7 @@
         <w:rPr>
           <w:rFonts w:asciiTheme="majorBidi" w:eastAsia="Calibri" w:hAnsiTheme="majorBidi" w:cstheme="majorBidi"/>
           <w:color w:val="000000"/>
-          <w:sz w:val="24"/>
+          <w:szCs w:val="20"/>
         </w:rPr>
         <w:t>1. I</w:t>
       </w:r>
@@ -536,7 +570,7 @@
         <w:rPr>
           <w:rFonts w:asciiTheme="majorBidi" w:eastAsia="Calibri" w:hAnsiTheme="majorBidi" w:cstheme="majorBidi"/>
           <w:color w:val="000000"/>
-          <w:sz w:val="24"/>
+          <w:szCs w:val="20"/>
         </w:rPr>
         <w:t xml:space="preserve">  </w:t>
       </w:r>
@@ -544,13 +578,15 @@
         <w:rPr>
           <w:rFonts w:asciiTheme="majorBidi" w:eastAsia="Calibri" w:hAnsiTheme="majorBidi" w:cstheme="majorBidi"/>
           <w:color w:val="000000"/>
-          <w:sz w:val="24"/>
+          <w:szCs w:val="20"/>
         </w:rPr>
         <w:t xml:space="preserve"> </w:t>
       </w:r>
       <w:r>
         <w:rPr>
           <w:rFonts w:asciiTheme="majorBidi" w:hAnsiTheme="majorBidi" w:cstheme="majorBidi"/>
+          <w:sz w:val="20"/>
+          <w:szCs w:val="20"/>
         </w:rPr>
         <w:t>{</w:t>
       </w:r>
@@ -558,6 +594,8 @@
       <w:r>
         <w:rPr>
           <w:rFonts w:asciiTheme="majorBidi" w:hAnsiTheme="majorBidi" w:cstheme="majorBidi"/>
+          <w:sz w:val="20"/>
+          <w:szCs w:val="20"/>
         </w:rPr>
         <w:t>{</w:t>
       </w:r>
@@ -565,6 +603,8 @@
         <w:rPr>
           <w:rFonts w:asciiTheme="majorBidi" w:eastAsia="ArialMT" w:hAnsiTheme="majorBidi" w:cstheme="majorBidi"/>
           <w:color w:val="000000"/>
+          <w:sz w:val="20"/>
+          <w:szCs w:val="20"/>
         </w:rPr>
         <w:t>SPNAME}}</w:t>
       </w:r>
@@ -572,7 +612,7 @@
         <w:rPr>
           <w:rFonts w:asciiTheme="majorBidi" w:eastAsia="Calibri" w:hAnsiTheme="majorBidi" w:cstheme="majorBidi"/>
           <w:color w:val="000000"/>
-          <w:sz w:val="24"/>
+          <w:szCs w:val="20"/>
         </w:rPr>
         <w:t xml:space="preserve"> </w:t>
       </w:r>
@@ -580,19 +620,23 @@
         <w:rPr>
           <w:rFonts w:asciiTheme="majorBidi" w:eastAsia="Calibri" w:hAnsiTheme="majorBidi" w:cstheme="majorBidi"/>
           <w:color w:val="000000"/>
-          <w:sz w:val="24"/>
+          <w:szCs w:val="20"/>
         </w:rPr>
         <w:t xml:space="preserve"> </w:t>
       </w:r>
       <w:r>
         <w:rPr>
           <w:rFonts w:asciiTheme="majorBidi" w:hAnsiTheme="majorBidi" w:cstheme="majorBidi"/>
+          <w:sz w:val="20"/>
+          <w:szCs w:val="20"/>
         </w:rPr>
         <w:tab/>
       </w:r>
       <w:r>
         <w:rPr>
           <w:rFonts w:asciiTheme="majorBidi" w:hAnsiTheme="majorBidi" w:cstheme="majorBidi"/>
+          <w:sz w:val="20"/>
+          <w:szCs w:val="20"/>
         </w:rPr>
         <w:tab/>
       </w:r>
@@ -609,17 +653,23 @@
         <w:ind w:right="288"/>
         <w:rPr>
           <w:rFonts w:asciiTheme="majorBidi" w:hAnsiTheme="majorBidi" w:cstheme="majorBidi"/>
+          <w:sz w:val="20"/>
+          <w:szCs w:val="20"/>
         </w:rPr>
       </w:pPr>
       <w:r>
         <w:rPr>
           <w:rFonts w:asciiTheme="majorBidi" w:hAnsiTheme="majorBidi" w:cstheme="majorBidi"/>
+          <w:sz w:val="20"/>
+          <w:szCs w:val="20"/>
         </w:rPr>
         <w:tab/>
       </w:r>
       <w:r>
         <w:rPr>
           <w:rFonts w:asciiTheme="majorBidi" w:hAnsiTheme="majorBidi" w:cstheme="majorBidi"/>
+          <w:sz w:val="20"/>
+          <w:szCs w:val="20"/>
         </w:rPr>
         <w:tab/>
       </w:r>
@@ -628,7 +678,7 @@
           <w:rFonts w:asciiTheme="majorBidi" w:eastAsia="Calibri" w:hAnsiTheme="majorBidi" w:cstheme="majorBidi"/>
           <w:i/>
           <w:color w:val="000000"/>
-          <w:sz w:val="24"/>
+          <w:szCs w:val="20"/>
         </w:rPr>
         <w:t xml:space="preserve"> </w:t>
       </w:r>
@@ -645,6 +695,8 @@
         <w:ind w:right="288"/>
         <w:rPr>
           <w:rFonts w:asciiTheme="majorBidi" w:hAnsiTheme="majorBidi" w:cstheme="majorBidi"/>
+          <w:sz w:val="20"/>
+          <w:szCs w:val="20"/>
         </w:rPr>
       </w:pPr>
     </w:p>
@@ -661,7 +713,7 @@
         <w:rPr>
           <w:rFonts w:asciiTheme="majorBidi" w:eastAsia="Calibri" w:hAnsiTheme="majorBidi" w:cstheme="majorBidi"/>
           <w:color w:val="000000"/>
-          <w:sz w:val="24"/>
+          <w:szCs w:val="20"/>
           <w:u w:val="dotted"/>
         </w:rPr>
       </w:pPr>
@@ -669,6 +721,8 @@
         <w:rPr>
           <w:rFonts w:asciiTheme="majorBidi" w:hAnsiTheme="majorBidi" w:cstheme="majorBidi"/>
           <w:noProof/>
+          <w:sz w:val="20"/>
+          <w:szCs w:val="20"/>
         </w:rPr>
         <mc:AlternateContent>
           <mc:Choice Requires="wps">
@@ -764,12 +818,16 @@
       <w:r>
         <w:rPr>
           <w:rFonts w:asciiTheme="majorBidi" w:hAnsiTheme="majorBidi" w:cstheme="majorBidi"/>
+          <w:sz w:val="20"/>
+          <w:szCs w:val="20"/>
         </w:rPr>
         <w:tab/>
       </w:r>
       <w:r>
         <w:rPr>
           <w:rFonts w:asciiTheme="majorBidi" w:hAnsiTheme="majorBidi" w:cstheme="majorBidi"/>
+          <w:sz w:val="20"/>
+          <w:szCs w:val="20"/>
         </w:rPr>
         <w:br/>
       </w:r>
@@ -777,7 +835,7 @@
         <w:rPr>
           <w:rFonts w:asciiTheme="majorBidi" w:eastAsia="Calibri" w:hAnsiTheme="majorBidi" w:cstheme="majorBidi"/>
           <w:color w:val="000000"/>
-          <w:sz w:val="24"/>
+          <w:szCs w:val="20"/>
         </w:rPr>
         <w:t>National of</w:t>
       </w:r>
@@ -785,7 +843,7 @@
         <w:rPr>
           <w:rFonts w:asciiTheme="majorBidi" w:eastAsia="Calibri" w:hAnsiTheme="majorBidi" w:cstheme="majorBidi"/>
           <w:color w:val="000000"/>
-          <w:sz w:val="24"/>
+          <w:szCs w:val="20"/>
         </w:rPr>
         <w:t xml:space="preserve"> </w:t>
       </w:r>
@@ -793,7 +851,7 @@
         <w:rPr>
           <w:rFonts w:asciiTheme="majorBidi" w:eastAsia="Calibri" w:hAnsiTheme="majorBidi" w:cstheme="majorBidi"/>
           <w:color w:val="000000"/>
-          <w:sz w:val="24"/>
+          <w:szCs w:val="20"/>
           <w:u w:val="dotted"/>
         </w:rPr>
         <w:t xml:space="preserve"> </w:t>
@@ -802,7 +860,7 @@
         <w:rPr>
           <w:rFonts w:asciiTheme="majorBidi" w:eastAsia="Calibri" w:hAnsiTheme="majorBidi" w:cstheme="majorBidi"/>
           <w:color w:val="000000"/>
-          <w:sz w:val="24"/>
+          <w:szCs w:val="20"/>
           <w:u w:val="dotted"/>
         </w:rPr>
         <w:t xml:space="preserve">   </w:t>
@@ -811,7 +869,7 @@
         <w:rPr>
           <w:rFonts w:asciiTheme="majorBidi" w:eastAsia="Calibri" w:hAnsiTheme="majorBidi" w:cstheme="majorBidi"/>
           <w:color w:val="000000"/>
-          <w:sz w:val="24"/>
+          <w:szCs w:val="20"/>
           <w:u w:val="dotted"/>
         </w:rPr>
         <w:t xml:space="preserve"> </w:t>
@@ -820,7 +878,7 @@
         <w:rPr>
           <w:rFonts w:asciiTheme="majorBidi" w:eastAsia="ArialMT" w:hAnsiTheme="majorBidi" w:cstheme="majorBidi"/>
           <w:color w:val="000000"/>
-          <w:sz w:val="24"/>
+          <w:szCs w:val="20"/>
           <w:u w:val="dotted"/>
         </w:rPr>
         <w:t>SAUDI ARABIA</w:t>
@@ -829,7 +887,7 @@
         <w:rPr>
           <w:rFonts w:asciiTheme="majorBidi" w:eastAsia="Calibri" w:hAnsiTheme="majorBidi" w:cstheme="majorBidi"/>
           <w:color w:val="000000"/>
-          <w:sz w:val="24"/>
+          <w:szCs w:val="20"/>
           <w:u w:val="dotted"/>
         </w:rPr>
         <w:t xml:space="preserve">                                                                                 </w:t>
@@ -838,7 +896,7 @@
         <w:rPr>
           <w:rFonts w:asciiTheme="majorBidi" w:eastAsia="Calibri" w:hAnsiTheme="majorBidi" w:cstheme="majorBidi"/>
           <w:color w:val="000000"/>
-          <w:sz w:val="24"/>
+          <w:szCs w:val="20"/>
           <w:u w:val="dotted"/>
         </w:rPr>
         <w:t xml:space="preserve">    </w:t>
@@ -847,7 +905,7 @@
         <w:rPr>
           <w:rFonts w:asciiTheme="majorBidi" w:eastAsia="Calibri" w:hAnsiTheme="majorBidi" w:cstheme="majorBidi"/>
           <w:color w:val="000000"/>
-          <w:sz w:val="24"/>
+          <w:szCs w:val="20"/>
           <w:u w:val="dotted"/>
         </w:rPr>
         <w:t xml:space="preserve">      </w:t>
@@ -856,7 +914,7 @@
         <w:rPr>
           <w:rFonts w:asciiTheme="majorBidi" w:eastAsia="Calibri" w:hAnsiTheme="majorBidi" w:cstheme="majorBidi"/>
           <w:color w:val="000000"/>
-          <w:sz w:val="24"/>
+          <w:szCs w:val="20"/>
           <w:u w:val="dotted"/>
         </w:rPr>
         <w:t xml:space="preserve">      </w:t>
@@ -866,7 +924,7 @@
         <w:rPr>
           <w:rFonts w:asciiTheme="majorBidi" w:eastAsia="Calibri" w:hAnsiTheme="majorBidi" w:cstheme="majorBidi"/>
           <w:color w:val="000000"/>
-          <w:sz w:val="24"/>
+          <w:szCs w:val="20"/>
           <w:u w:val="dotted"/>
         </w:rPr>
         <w:t xml:space="preserve">  </w:t>
@@ -875,7 +933,7 @@
         <w:rPr>
           <w:rFonts w:asciiTheme="majorBidi" w:eastAsia="Calibri" w:hAnsiTheme="majorBidi" w:cstheme="majorBidi"/>
           <w:color w:val="000000"/>
-          <w:sz w:val="24"/>
+          <w:szCs w:val="20"/>
           <w:u w:val="dotted"/>
         </w:rPr>
         <w:t>.</w:t>
@@ -885,7 +943,7 @@
         <w:rPr>
           <w:rFonts w:asciiTheme="majorBidi" w:eastAsia="Calibri" w:hAnsiTheme="majorBidi" w:cstheme="majorBidi"/>
           <w:color w:val="000000"/>
-          <w:sz w:val="24"/>
+          <w:szCs w:val="20"/>
           <w:u w:val="dotted"/>
         </w:rPr>
         <w:t xml:space="preserve"> </w:t>
@@ -903,6 +961,8 @@
         <w:ind w:right="288"/>
         <w:rPr>
           <w:rFonts w:asciiTheme="majorBidi" w:hAnsiTheme="majorBidi" w:cstheme="majorBidi"/>
+          <w:sz w:val="20"/>
+          <w:szCs w:val="20"/>
         </w:rPr>
       </w:pPr>
       <w:r>
@@ -910,19 +970,23 @@
           <w:rFonts w:asciiTheme="majorBidi" w:eastAsia="Calibri" w:hAnsiTheme="majorBidi" w:cstheme="majorBidi"/>
           <w:i/>
           <w:color w:val="000000"/>
-          <w:sz w:val="24"/>
+          <w:szCs w:val="20"/>
         </w:rPr>
         <w:t xml:space="preserve">and </w:t>
       </w:r>
       <w:r>
         <w:rPr>
           <w:rFonts w:asciiTheme="majorBidi" w:hAnsiTheme="majorBidi" w:cstheme="majorBidi"/>
+          <w:sz w:val="20"/>
+          <w:szCs w:val="20"/>
         </w:rPr>
         <w:tab/>
       </w:r>
       <w:r>
         <w:rPr>
           <w:rFonts w:asciiTheme="majorBidi" w:hAnsiTheme="majorBidi" w:cstheme="majorBidi"/>
+          <w:sz w:val="20"/>
+          <w:szCs w:val="20"/>
         </w:rPr>
         <w:tab/>
       </w:r>
@@ -939,23 +1003,31 @@
         <w:ind w:right="288"/>
         <w:rPr>
           <w:rFonts w:asciiTheme="majorBidi" w:hAnsiTheme="majorBidi" w:cstheme="majorBidi"/>
+          <w:sz w:val="20"/>
+          <w:szCs w:val="20"/>
         </w:rPr>
       </w:pPr>
       <w:r>
         <w:rPr>
           <w:rFonts w:asciiTheme="majorBidi" w:hAnsiTheme="majorBidi" w:cstheme="majorBidi"/>
+          <w:sz w:val="20"/>
+          <w:szCs w:val="20"/>
         </w:rPr>
         <w:tab/>
       </w:r>
       <w:r>
         <w:rPr>
           <w:rFonts w:asciiTheme="majorBidi" w:hAnsiTheme="majorBidi" w:cstheme="majorBidi"/>
+          <w:sz w:val="20"/>
+          <w:szCs w:val="20"/>
         </w:rPr>
         <w:tab/>
       </w:r>
       <w:r>
         <w:rPr>
           <w:rFonts w:asciiTheme="majorBidi" w:hAnsiTheme="majorBidi" w:cstheme="majorBidi"/>
+          <w:sz w:val="20"/>
+          <w:szCs w:val="20"/>
         </w:rPr>
         <w:t xml:space="preserve">       </w:t>
       </w:r>
@@ -963,7 +1035,7 @@
         <w:rPr>
           <w:rFonts w:asciiTheme="majorBidi" w:eastAsia="ArialMT" w:hAnsiTheme="majorBidi" w:cstheme="majorBidi"/>
           <w:color w:val="000000"/>
-          <w:sz w:val="24"/>
+          <w:szCs w:val="20"/>
         </w:rPr>
         <w:t xml:space="preserve">       </w:t>
       </w:r>
@@ -981,7 +1053,7 @@
         <w:rPr>
           <w:rFonts w:asciiTheme="majorBidi" w:eastAsia="Calibri" w:hAnsiTheme="majorBidi" w:cstheme="majorBidi"/>
           <w:color w:val="000000"/>
-          <w:sz w:val="24"/>
+          <w:szCs w:val="20"/>
         </w:rPr>
       </w:pPr>
     </w:p>
@@ -998,18 +1070,20 @@
         <w:rPr>
           <w:rFonts w:asciiTheme="majorBidi" w:eastAsia="Calibri" w:hAnsiTheme="majorBidi" w:cstheme="majorBidi"/>
           <w:color w:val="000000"/>
-          <w:sz w:val="24"/>
+          <w:szCs w:val="20"/>
         </w:rPr>
       </w:pPr>
       <w:r>
         <w:rPr>
           <w:rFonts w:asciiTheme="majorBidi" w:hAnsiTheme="majorBidi" w:cstheme="majorBidi"/>
           <w:noProof/>
+          <w:sz w:val="20"/>
+          <w:szCs w:val="20"/>
         </w:rPr>
         <mc:AlternateContent>
           <mc:Choice Requires="wps">
             <w:drawing>
-              <wp:anchor distT="0" distB="0" distL="114300" distR="114300" simplePos="0" relativeHeight="251660288" behindDoc="1" locked="1" layoutInCell="1" allowOverlap="1" wp14:anchorId="0362729D" wp14:editId="44B51C6E">
+              <wp:anchor distT="0" distB="0" distL="114300" distR="114300" simplePos="0" relativeHeight="251661312" behindDoc="1" locked="1" layoutInCell="1" allowOverlap="1" wp14:anchorId="0362729D" wp14:editId="6F39EF4F">
                 <wp:simplePos x="0" y="0"/>
                 <wp:positionH relativeFrom="column">
                   <wp:posOffset>1696085</wp:posOffset>
@@ -1159,7 +1233,7 @@
           </mc:Choice>
           <mc:Fallback>
             <w:pict>
-              <v:shape w14:anchorId="0362729D" id="_x0000_s1029" type="#_x0000_t202" style="position:absolute;margin-left:133.55pt;margin-top:219.15pt;width:377.55pt;height:23.55pt;z-index:-251656192;visibility:visible;mso-wrap-style:square;mso-width-percent:0;mso-height-percent:0;mso-wrap-distance-left:9pt;mso-wrap-distance-top:0;mso-wrap-distance-right:9pt;mso-wrap-distance-bottom:0;mso-position-horizontal:absolute;mso-position-horizontal-relative:text;mso-position-vertical:absolute;mso-position-vertical-relative:page;mso-width-percent:0;mso-height-percent:0;mso-width-relative:margin;mso-height-relative:margin;v-text-anchor:top" o:gfxdata="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" filled="f" stroked="f" strokeweight=".5pt">
+              <v:shape w14:anchorId="0362729D" id="_x0000_s1029" type="#_x0000_t202" style="position:absolute;margin-left:133.55pt;margin-top:219.15pt;width:377.55pt;height:23.55pt;z-index:-251655168;visibility:visible;mso-wrap-style:square;mso-width-percent:0;mso-height-percent:0;mso-wrap-distance-left:9pt;mso-wrap-distance-top:0;mso-wrap-distance-right:9pt;mso-wrap-distance-bottom:0;mso-position-horizontal:absolute;mso-position-horizontal-relative:text;mso-position-vertical:absolute;mso-position-vertical-relative:page;mso-width-percent:0;mso-height-percent:0;mso-width-relative:margin;mso-height-relative:margin;v-text-anchor:top" o:gfxdata="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" filled="f" stroked="f" strokeweight=".5pt">
                 <v:textbox>
                   <w:txbxContent>
                     <w:p>
@@ -1281,14 +1355,14 @@
         <w:rPr>
           <w:rFonts w:asciiTheme="majorBidi" w:eastAsia="Calibri" w:hAnsiTheme="majorBidi" w:cstheme="majorBidi"/>
           <w:color w:val="000000"/>
-          <w:sz w:val="24"/>
+          <w:szCs w:val="20"/>
         </w:rPr>
       </w:pPr>
       <w:r>
         <w:rPr>
           <w:rFonts w:asciiTheme="majorBidi" w:eastAsia="Calibri" w:hAnsiTheme="majorBidi" w:cstheme="majorBidi"/>
           <w:color w:val="000000"/>
-          <w:sz w:val="24"/>
+          <w:szCs w:val="20"/>
         </w:rPr>
         <w:t xml:space="preserve">having residential address </w:t>
       </w:r>
@@ -1297,7 +1371,7 @@
         <w:rPr>
           <w:rFonts w:asciiTheme="majorBidi" w:eastAsia="Calibri" w:hAnsiTheme="majorBidi" w:cstheme="majorBidi"/>
           <w:color w:val="000000"/>
-          <w:sz w:val="24"/>
+          <w:szCs w:val="20"/>
         </w:rPr>
         <w:t>at</w:t>
       </w:r>
@@ -1305,13 +1379,15 @@
         <w:rPr>
           <w:rFonts w:asciiTheme="majorBidi" w:eastAsia="Calibri" w:hAnsiTheme="majorBidi" w:cstheme="majorBidi"/>
           <w:color w:val="000000"/>
-          <w:sz w:val="24"/>
+          <w:szCs w:val="20"/>
         </w:rPr>
         <w:t xml:space="preserve">  </w:t>
       </w:r>
       <w:r>
         <w:rPr>
           <w:rFonts w:asciiTheme="majorBidi" w:hAnsiTheme="majorBidi" w:cstheme="majorBidi"/>
+          <w:sz w:val="20"/>
+          <w:szCs w:val="20"/>
         </w:rPr>
         <w:t>{</w:t>
       </w:r>
@@ -1319,6 +1395,8 @@
       <w:r>
         <w:rPr>
           <w:rFonts w:asciiTheme="majorBidi" w:hAnsiTheme="majorBidi" w:cstheme="majorBidi"/>
+          <w:sz w:val="20"/>
+          <w:szCs w:val="20"/>
         </w:rPr>
         <w:t>{</w:t>
       </w:r>
@@ -1326,6 +1404,8 @@
         <w:rPr>
           <w:rFonts w:asciiTheme="majorBidi" w:eastAsia="ArialMT" w:hAnsiTheme="majorBidi" w:cstheme="majorBidi"/>
           <w:color w:val="000000"/>
+          <w:sz w:val="20"/>
+          <w:szCs w:val="20"/>
         </w:rPr>
         <w:t>SPADD}}</w:t>
       </w:r>
@@ -1344,12 +1424,16 @@
         <w:ind w:right="-1006"/>
         <w:rPr>
           <w:rFonts w:asciiTheme="majorBidi" w:hAnsiTheme="majorBidi" w:cstheme="majorBidi"/>
+          <w:sz w:val="20"/>
+          <w:szCs w:val="20"/>
         </w:rPr>
       </w:pPr>
       <w:r>
         <w:rPr>
           <w:rFonts w:asciiTheme="majorBidi" w:hAnsiTheme="majorBidi" w:cstheme="majorBidi"/>
           <w:noProof/>
+          <w:sz w:val="20"/>
+          <w:szCs w:val="20"/>
         </w:rPr>
         <mc:AlternateContent>
           <mc:Choice Requires="wps">
@@ -1466,13 +1550,15 @@
         <w:rPr>
           <w:rFonts w:asciiTheme="majorBidi" w:eastAsia="Calibri" w:hAnsiTheme="majorBidi" w:cstheme="majorBidi"/>
           <w:color w:val="000000"/>
-          <w:sz w:val="24"/>
+          <w:szCs w:val="20"/>
         </w:rPr>
         <w:tab/>
       </w:r>
       <w:r>
         <w:rPr>
           <w:rFonts w:asciiTheme="majorBidi" w:hAnsiTheme="majorBidi" w:cstheme="majorBidi"/>
+          <w:sz w:val="20"/>
+          <w:szCs w:val="20"/>
         </w:rPr>
         <w:tab/>
       </w:r>
@@ -1491,6 +1577,8 @@
         <w:ind w:right="-1006"/>
         <w:rPr>
           <w:rFonts w:asciiTheme="majorBidi" w:hAnsiTheme="majorBidi" w:cstheme="majorBidi"/>
+          <w:sz w:val="20"/>
+          <w:szCs w:val="20"/>
         </w:rPr>
       </w:pPr>
     </w:p>
@@ -1508,12 +1596,16 @@
         <w:ind w:right="-1006"/>
         <w:rPr>
           <w:rFonts w:asciiTheme="majorBidi" w:hAnsiTheme="majorBidi" w:cstheme="majorBidi"/>
+          <w:sz w:val="20"/>
+          <w:szCs w:val="20"/>
         </w:rPr>
       </w:pPr>
       <w:r>
         <w:rPr>
           <w:rFonts w:asciiTheme="majorBidi" w:hAnsiTheme="majorBidi" w:cstheme="majorBidi"/>
           <w:noProof/>
+          <w:sz w:val="20"/>
+          <w:szCs w:val="20"/>
         </w:rPr>
         <mc:AlternateContent>
           <mc:Choice Requires="wps">
@@ -1618,6 +1710,8 @@
         <w:rPr>
           <w:rFonts w:asciiTheme="majorBidi" w:hAnsiTheme="majorBidi" w:cstheme="majorBidi"/>
           <w:noProof/>
+          <w:sz w:val="20"/>
+          <w:szCs w:val="20"/>
         </w:rPr>
         <mc:AlternateContent>
           <mc:Choice Requires="wps">
@@ -1802,30 +1896,40 @@
       <w:r>
         <w:rPr>
           <w:rFonts w:asciiTheme="majorBidi" w:hAnsiTheme="majorBidi" w:cstheme="majorBidi"/>
+          <w:sz w:val="20"/>
+          <w:szCs w:val="20"/>
         </w:rPr>
         <w:tab/>
       </w:r>
       <w:r>
         <w:rPr>
           <w:rFonts w:asciiTheme="majorBidi" w:hAnsiTheme="majorBidi" w:cstheme="majorBidi"/>
+          <w:sz w:val="20"/>
+          <w:szCs w:val="20"/>
         </w:rPr>
         <w:tab/>
       </w:r>
       <w:r>
         <w:rPr>
           <w:rFonts w:asciiTheme="majorBidi" w:hAnsiTheme="majorBidi" w:cstheme="majorBidi"/>
+          <w:sz w:val="20"/>
+          <w:szCs w:val="20"/>
         </w:rPr>
         <w:tab/>
       </w:r>
       <w:r>
         <w:rPr>
           <w:rFonts w:asciiTheme="majorBidi" w:hAnsiTheme="majorBidi" w:cstheme="majorBidi"/>
+          <w:sz w:val="20"/>
+          <w:szCs w:val="20"/>
         </w:rPr>
         <w:t xml:space="preserve">  </w:t>
       </w:r>
       <w:r>
         <w:rPr>
           <w:rFonts w:asciiTheme="majorBidi" w:hAnsiTheme="majorBidi" w:cstheme="majorBidi"/>
+          <w:sz w:val="20"/>
+          <w:szCs w:val="20"/>
         </w:rPr>
         <w:br/>
       </w:r>
@@ -1833,7 +1937,7 @@
         <w:rPr>
           <w:rFonts w:asciiTheme="majorBidi" w:eastAsia="Calibri" w:hAnsiTheme="majorBidi" w:cstheme="majorBidi"/>
           <w:color w:val="000000"/>
-          <w:sz w:val="24"/>
+          <w:szCs w:val="20"/>
         </w:rPr>
         <w:t xml:space="preserve">and having Personal Identification </w:t>
       </w:r>
@@ -1842,15 +1946,13 @@
         <w:rPr>
           <w:rFonts w:asciiTheme="majorBidi" w:eastAsia="Calibri" w:hAnsiTheme="majorBidi" w:cstheme="majorBidi"/>
           <w:color w:val="000000"/>
-          <w:sz w:val="24"/>
+          <w:szCs w:val="20"/>
         </w:rPr>
         <w:t xml:space="preserve">No  </w:t>
       </w:r>
       <w:r>
         <w:rPr>
           <w:rFonts w:asciiTheme="majorBidi" w:hAnsiTheme="majorBidi" w:cstheme="majorBidi"/>
-          <w:sz w:val="24"/>
-          <w:szCs w:val="24"/>
         </w:rPr>
         <w:t>{</w:t>
       </w:r>
@@ -1858,8 +1960,6 @@
       <w:r>
         <w:rPr>
           <w:rFonts w:asciiTheme="majorBidi" w:hAnsiTheme="majorBidi" w:cstheme="majorBidi"/>
-          <w:sz w:val="24"/>
-          <w:szCs w:val="24"/>
         </w:rPr>
         <w:t>{</w:t>
       </w:r>
@@ -1867,8 +1967,6 @@
         <w:rPr>
           <w:rFonts w:asciiTheme="majorBidi" w:eastAsia="ArialMT" w:hAnsiTheme="majorBidi" w:cstheme="majorBidi"/>
           <w:color w:val="000000"/>
-          <w:sz w:val="24"/>
-          <w:szCs w:val="24"/>
         </w:rPr>
         <w:t>CRNONDIDNO}}</w:t>
       </w:r>
@@ -1876,13 +1974,15 @@
         <w:rPr>
           <w:rFonts w:asciiTheme="majorBidi" w:eastAsia="Calibri" w:hAnsiTheme="majorBidi" w:cstheme="majorBidi"/>
           <w:color w:val="000000"/>
-          <w:sz w:val="24"/>
+          <w:szCs w:val="20"/>
         </w:rPr>
         <w:t xml:space="preserve"> </w:t>
       </w:r>
       <w:r>
         <w:rPr>
           <w:rFonts w:asciiTheme="majorBidi" w:hAnsiTheme="majorBidi" w:cstheme="majorBidi"/>
+          <w:sz w:val="20"/>
+          <w:szCs w:val="20"/>
         </w:rPr>
         <w:tab/>
       </w:r>
@@ -1902,7 +2002,7 @@
         <w:rPr>
           <w:rFonts w:asciiTheme="majorBidi" w:eastAsia="Calibri" w:hAnsiTheme="majorBidi" w:cstheme="majorBidi"/>
           <w:color w:val="000000"/>
-          <w:sz w:val="24"/>
+          <w:szCs w:val="20"/>
         </w:rPr>
       </w:pPr>
     </w:p>
@@ -1915,6 +2015,8 @@
         <w:rPr>
           <w:rFonts w:asciiTheme="majorBidi" w:eastAsia="ArialMT" w:hAnsiTheme="majorBidi" w:cstheme="majorBidi"/>
           <w:color w:val="000000"/>
+          <w:sz w:val="20"/>
+          <w:szCs w:val="20"/>
         </w:rPr>
       </w:pPr>
     </w:p>
@@ -1927,13 +2029,15 @@
         <w:rPr>
           <w:rFonts w:asciiTheme="majorBidi" w:eastAsia="Calibri" w:hAnsiTheme="majorBidi" w:cstheme="majorBidi"/>
           <w:color w:val="000000"/>
+          <w:sz w:val="20"/>
+          <w:szCs w:val="20"/>
         </w:rPr>
       </w:pPr>
       <w:r>
         <w:rPr>
           <w:rFonts w:asciiTheme="majorBidi" w:eastAsia="Calibri" w:hAnsiTheme="majorBidi" w:cstheme="majorBidi"/>
           <w:color w:val="000000"/>
-          <w:sz w:val="24"/>
+          <w:szCs w:val="20"/>
         </w:rPr>
         <w:t>issued by</w:t>
       </w:r>
@@ -1941,7 +2045,7 @@
         <w:rPr>
           <w:rFonts w:asciiTheme="majorBidi" w:eastAsia="Calibri" w:hAnsiTheme="majorBidi" w:cstheme="majorBidi"/>
           <w:color w:val="000000"/>
-          <w:sz w:val="24"/>
+          <w:szCs w:val="20"/>
         </w:rPr>
         <w:t xml:space="preserve"> </w:t>
       </w:r>
@@ -1949,7 +2053,7 @@
         <w:rPr>
           <w:rFonts w:asciiTheme="majorBidi" w:eastAsia="Calibri" w:hAnsiTheme="majorBidi" w:cstheme="majorBidi"/>
           <w:color w:val="000000"/>
-          <w:sz w:val="24"/>
+          <w:szCs w:val="20"/>
           <w:u w:val="dotted"/>
         </w:rPr>
         <w:t xml:space="preserve">          </w:t>
@@ -1958,7 +2062,7 @@
         <w:rPr>
           <w:rFonts w:asciiTheme="majorBidi" w:eastAsia="Calibri" w:hAnsiTheme="majorBidi" w:cstheme="majorBidi"/>
           <w:color w:val="000000"/>
-          <w:sz w:val="24"/>
+          <w:szCs w:val="20"/>
           <w:u w:val="dotted"/>
         </w:rPr>
         <w:t>SAUDI ARABIA</w:t>
@@ -1967,7 +2071,7 @@
         <w:rPr>
           <w:rFonts w:asciiTheme="majorBidi" w:eastAsia="Calibri" w:hAnsiTheme="majorBidi" w:cstheme="majorBidi"/>
           <w:color w:val="000000"/>
-          <w:sz w:val="24"/>
+          <w:szCs w:val="20"/>
           <w:u w:val="dotted"/>
         </w:rPr>
         <w:t xml:space="preserve">                    </w:t>
@@ -1976,7 +2080,7 @@
         <w:rPr>
           <w:rFonts w:asciiTheme="majorBidi" w:eastAsia="Calibri" w:hAnsiTheme="majorBidi" w:cstheme="majorBidi"/>
           <w:color w:val="000000"/>
-          <w:sz w:val="24"/>
+          <w:szCs w:val="20"/>
           <w:u w:val="dotted"/>
         </w:rPr>
         <w:t xml:space="preserve">                                   </w:t>
@@ -1985,6 +2089,8 @@
         <w:rPr>
           <w:rFonts w:asciiTheme="majorBidi" w:eastAsia="Calibri" w:hAnsiTheme="majorBidi" w:cstheme="majorBidi"/>
           <w:color w:val="000000"/>
+          <w:sz w:val="20"/>
+          <w:szCs w:val="20"/>
           <w:u w:val="dotted"/>
         </w:rPr>
         <w:t xml:space="preserve">                       </w:t>
@@ -1994,6 +2100,8 @@
         <w:rPr>
           <w:rFonts w:asciiTheme="majorBidi" w:eastAsia="Calibri" w:hAnsiTheme="majorBidi" w:cstheme="majorBidi"/>
           <w:color w:val="000000"/>
+          <w:sz w:val="20"/>
+          <w:szCs w:val="20"/>
           <w:u w:val="dotted"/>
         </w:rPr>
         <w:t xml:space="preserve">  </w:t>
@@ -2002,7 +2110,7 @@
         <w:rPr>
           <w:rFonts w:asciiTheme="majorBidi" w:eastAsia="Calibri" w:hAnsiTheme="majorBidi" w:cstheme="majorBidi"/>
           <w:color w:val="000000"/>
-          <w:sz w:val="24"/>
+          <w:szCs w:val="20"/>
         </w:rPr>
         <w:t>,</w:t>
       </w:r>
@@ -2011,7 +2119,7 @@
         <w:rPr>
           <w:rFonts w:asciiTheme="majorBidi" w:eastAsia="Calibri" w:hAnsiTheme="majorBidi" w:cstheme="majorBidi"/>
           <w:color w:val="000000"/>
-          <w:sz w:val="24"/>
+          <w:szCs w:val="20"/>
         </w:rPr>
         <w:t xml:space="preserve"> (a Govt. Authority) </w:t>
       </w:r>
@@ -2023,6 +2131,8 @@
         <w:spacing w:after="0" w:line="197" w:lineRule="auto"/>
         <w:rPr>
           <w:rFonts w:asciiTheme="majorBidi" w:hAnsiTheme="majorBidi" w:cstheme="majorBidi"/>
+          <w:sz w:val="20"/>
+          <w:szCs w:val="20"/>
         </w:rPr>
       </w:pPr>
       <w:r>
@@ -2030,7 +2140,7 @@
           <w:rFonts w:asciiTheme="majorBidi" w:eastAsia="Calibri" w:hAnsiTheme="majorBidi" w:cstheme="majorBidi"/>
           <w:i/>
           <w:color w:val="000000"/>
-          <w:sz w:val="24"/>
+          <w:szCs w:val="20"/>
         </w:rPr>
         <w:t xml:space="preserve">(Name of the Agency who has issued the Personal Identification No.to the Authorized Signatory) </w:t>
       </w:r>
@@ -2042,13 +2152,15 @@
         <w:spacing w:before="346" w:after="0" w:line="245" w:lineRule="auto"/>
         <w:rPr>
           <w:rFonts w:asciiTheme="majorBidi" w:hAnsiTheme="majorBidi" w:cstheme="majorBidi"/>
+          <w:sz w:val="20"/>
+          <w:szCs w:val="20"/>
         </w:rPr>
       </w:pPr>
       <w:r>
         <w:rPr>
           <w:rFonts w:asciiTheme="majorBidi" w:eastAsia="Calibri" w:hAnsiTheme="majorBidi" w:cstheme="majorBidi"/>
           <w:color w:val="000000"/>
-          <w:sz w:val="24"/>
+          <w:szCs w:val="20"/>
         </w:rPr>
         <w:t xml:space="preserve">hereby apply for registration of myself as Foreign Employer (FE) in the </w:t>
       </w:r>
@@ -2057,7 +2169,7 @@
         <w:rPr>
           <w:rFonts w:asciiTheme="majorBidi" w:eastAsia="Calibri" w:hAnsiTheme="majorBidi" w:cstheme="majorBidi"/>
           <w:color w:val="000000"/>
-          <w:sz w:val="24"/>
+          <w:szCs w:val="20"/>
         </w:rPr>
         <w:t>eMigrate</w:t>
       </w:r>
@@ -2066,7 +2178,7 @@
         <w:rPr>
           <w:rFonts w:asciiTheme="majorBidi" w:eastAsia="Calibri" w:hAnsiTheme="majorBidi" w:cstheme="majorBidi"/>
           <w:color w:val="000000"/>
-          <w:sz w:val="24"/>
+          <w:szCs w:val="20"/>
         </w:rPr>
         <w:t xml:space="preserve"> System of Govt. of India, through Indian Mission in </w:t>
       </w:r>
@@ -2082,11 +2194,15 @@
         <w:ind w:right="288"/>
         <w:rPr>
           <w:rFonts w:asciiTheme="majorBidi" w:hAnsiTheme="majorBidi" w:cstheme="majorBidi"/>
+          <w:sz w:val="20"/>
+          <w:szCs w:val="20"/>
         </w:rPr>
       </w:pPr>
       <w:r>
         <w:rPr>
           <w:rFonts w:asciiTheme="majorBidi" w:hAnsiTheme="majorBidi" w:cstheme="majorBidi"/>
+          <w:sz w:val="20"/>
+          <w:szCs w:val="20"/>
         </w:rPr>
         <w:tab/>
       </w:r>
@@ -2094,7 +2210,7 @@
         <w:rPr>
           <w:rFonts w:asciiTheme="majorBidi" w:eastAsia="ArialMT" w:hAnsiTheme="majorBidi" w:cstheme="majorBidi"/>
           <w:color w:val="000000"/>
-          <w:sz w:val="24"/>
+          <w:szCs w:val="20"/>
         </w:rPr>
         <w:t>EMBASSY OF INDIA,</w:t>
       </w:r>
@@ -2102,7 +2218,7 @@
         <w:rPr>
           <w:rFonts w:asciiTheme="majorBidi" w:eastAsia="ArialMT" w:hAnsiTheme="majorBidi" w:cstheme="majorBidi"/>
           <w:color w:val="000000"/>
-          <w:sz w:val="24"/>
+          <w:szCs w:val="20"/>
         </w:rPr>
         <w:t xml:space="preserve"> </w:t>
       </w:r>
@@ -2110,13 +2226,15 @@
         <w:rPr>
           <w:rFonts w:asciiTheme="majorBidi" w:eastAsia="ArialMT" w:hAnsiTheme="majorBidi" w:cstheme="majorBidi"/>
           <w:color w:val="000000"/>
-          <w:sz w:val="24"/>
+          <w:szCs w:val="20"/>
         </w:rPr>
         <w:t>SAUDI ARABIA</w:t>
       </w:r>
       <w:r>
         <w:rPr>
           <w:rFonts w:asciiTheme="majorBidi" w:hAnsiTheme="majorBidi" w:cstheme="majorBidi"/>
+          <w:sz w:val="20"/>
+          <w:szCs w:val="20"/>
         </w:rPr>
         <w:br/>
       </w:r>
@@ -2124,7 +2242,7 @@
         <w:rPr>
           <w:rFonts w:asciiTheme="majorBidi" w:eastAsia="Calibri" w:hAnsiTheme="majorBidi" w:cstheme="majorBidi"/>
           <w:color w:val="000000"/>
-          <w:sz w:val="24"/>
+          <w:szCs w:val="20"/>
         </w:rPr>
         <w:t xml:space="preserve">…………………………………………………………………………………………. </w:t>
       </w:r>
@@ -2137,6 +2255,8 @@
         <w:jc w:val="center"/>
         <w:rPr>
           <w:rFonts w:asciiTheme="majorBidi" w:hAnsiTheme="majorBidi" w:cstheme="majorBidi"/>
+          <w:sz w:val="20"/>
+          <w:szCs w:val="20"/>
         </w:rPr>
       </w:pPr>
       <w:r>
@@ -2144,7 +2264,7 @@
           <w:rFonts w:asciiTheme="majorBidi" w:eastAsia="Calibri" w:hAnsiTheme="majorBidi" w:cstheme="majorBidi"/>
           <w:i/>
           <w:color w:val="000000"/>
-          <w:sz w:val="24"/>
+          <w:szCs w:val="20"/>
         </w:rPr>
         <w:t xml:space="preserve">(Name of the city and country where Indian Embassy/ Consulate is located) </w:t>
       </w:r>
@@ -2157,7 +2277,7 @@
         <w:rPr>
           <w:rFonts w:asciiTheme="majorBidi" w:eastAsia="Calibri" w:hAnsiTheme="majorBidi" w:cstheme="majorBidi"/>
           <w:color w:val="000000"/>
-          <w:sz w:val="24"/>
+          <w:szCs w:val="20"/>
         </w:rPr>
       </w:pPr>
     </w:p>
@@ -2169,7 +2289,7 @@
         <w:rPr>
           <w:rFonts w:asciiTheme="majorBidi" w:eastAsia="Calibri" w:hAnsiTheme="majorBidi" w:cstheme="majorBidi"/>
           <w:color w:val="000000"/>
-          <w:sz w:val="24"/>
+          <w:szCs w:val="20"/>
         </w:rPr>
       </w:pPr>
     </w:p>
@@ -2180,13 +2300,15 @@
         <w:spacing w:after="0" w:line="197" w:lineRule="auto"/>
         <w:rPr>
           <w:rFonts w:asciiTheme="majorBidi" w:hAnsiTheme="majorBidi" w:cstheme="majorBidi"/>
+          <w:sz w:val="20"/>
+          <w:szCs w:val="20"/>
         </w:rPr>
       </w:pPr>
       <w:r>
         <w:rPr>
           <w:rFonts w:asciiTheme="majorBidi" w:eastAsia="Calibri" w:hAnsiTheme="majorBidi" w:cstheme="majorBidi"/>
           <w:color w:val="000000"/>
-          <w:sz w:val="24"/>
+          <w:szCs w:val="20"/>
         </w:rPr>
         <w:t xml:space="preserve">2.I certify that the information provided in this Request Letter and in online application form is </w:t>
       </w:r>
@@ -2198,13 +2320,15 @@
         <w:spacing w:after="0" w:line="197" w:lineRule="auto"/>
         <w:rPr>
           <w:rFonts w:asciiTheme="majorBidi" w:hAnsiTheme="majorBidi" w:cstheme="majorBidi"/>
+          <w:sz w:val="20"/>
+          <w:szCs w:val="20"/>
         </w:rPr>
       </w:pPr>
       <w:r>
         <w:rPr>
           <w:rFonts w:asciiTheme="majorBidi" w:eastAsia="Calibri" w:hAnsiTheme="majorBidi" w:cstheme="majorBidi"/>
           <w:color w:val="000000"/>
-          <w:sz w:val="24"/>
+          <w:szCs w:val="20"/>
         </w:rPr>
         <w:t xml:space="preserve">correct. </w:t>
       </w:r>
@@ -2216,13 +2340,15 @@
         <w:spacing w:before="200" w:after="0" w:line="197" w:lineRule="auto"/>
         <w:rPr>
           <w:rFonts w:asciiTheme="majorBidi" w:hAnsiTheme="majorBidi" w:cstheme="majorBidi"/>
+          <w:sz w:val="20"/>
+          <w:szCs w:val="20"/>
         </w:rPr>
       </w:pPr>
       <w:r>
         <w:rPr>
           <w:rFonts w:asciiTheme="majorBidi" w:eastAsia="Calibri" w:hAnsiTheme="majorBidi" w:cstheme="majorBidi"/>
           <w:color w:val="000000"/>
-          <w:sz w:val="24"/>
+          <w:szCs w:val="20"/>
         </w:rPr>
         <w:t xml:space="preserve">3.I undertake that I shall abide by the rules and regulations as required time to time by the </w:t>
       </w:r>
@@ -2234,6 +2360,8 @@
         <w:spacing w:before="100" w:after="0" w:line="197" w:lineRule="auto"/>
         <w:rPr>
           <w:rFonts w:asciiTheme="majorBidi" w:hAnsiTheme="majorBidi" w:cstheme="majorBidi"/>
+          <w:sz w:val="20"/>
+          <w:szCs w:val="20"/>
         </w:rPr>
       </w:pPr>
       <w:proofErr w:type="spellStart"/>
@@ -2241,7 +2369,7 @@
         <w:rPr>
           <w:rFonts w:asciiTheme="majorBidi" w:eastAsia="Calibri" w:hAnsiTheme="majorBidi" w:cstheme="majorBidi"/>
           <w:color w:val="000000"/>
-          <w:sz w:val="24"/>
+          <w:szCs w:val="20"/>
         </w:rPr>
         <w:t>eMigrate</w:t>
       </w:r>
@@ -2250,7 +2378,7 @@
         <w:rPr>
           <w:rFonts w:asciiTheme="majorBidi" w:eastAsia="Calibri" w:hAnsiTheme="majorBidi" w:cstheme="majorBidi"/>
           <w:color w:val="000000"/>
-          <w:sz w:val="24"/>
+          <w:szCs w:val="20"/>
         </w:rPr>
         <w:t xml:space="preserve"> System or the Govt. of India. </w:t>
       </w:r>
@@ -2262,13 +2390,15 @@
         <w:spacing w:before="428" w:after="0" w:line="197" w:lineRule="auto"/>
         <w:rPr>
           <w:rFonts w:asciiTheme="majorBidi" w:hAnsiTheme="majorBidi" w:cstheme="majorBidi"/>
+          <w:sz w:val="20"/>
+          <w:szCs w:val="20"/>
         </w:rPr>
       </w:pPr>
       <w:r>
         <w:rPr>
           <w:rFonts w:asciiTheme="majorBidi" w:eastAsia="Calibri" w:hAnsiTheme="majorBidi" w:cstheme="majorBidi"/>
           <w:color w:val="000000"/>
-          <w:sz w:val="24"/>
+          <w:szCs w:val="20"/>
         </w:rPr>
         <w:t xml:space="preserve">4.I undertake that in case of any Indian worker employed by my, desires to go back to his/ her </w:t>
       </w:r>
@@ -2280,13 +2410,15 @@
         <w:spacing w:before="98" w:after="0" w:line="197" w:lineRule="auto"/>
         <w:rPr>
           <w:rFonts w:asciiTheme="majorBidi" w:hAnsiTheme="majorBidi" w:cstheme="majorBidi"/>
+          <w:sz w:val="20"/>
+          <w:szCs w:val="20"/>
         </w:rPr>
       </w:pPr>
       <w:r>
         <w:rPr>
           <w:rFonts w:asciiTheme="majorBidi" w:eastAsia="Calibri" w:hAnsiTheme="majorBidi" w:cstheme="majorBidi"/>
           <w:color w:val="000000"/>
-          <w:sz w:val="24"/>
+          <w:szCs w:val="20"/>
         </w:rPr>
         <w:t xml:space="preserve">country before completion of employment contract for any reason, I shall give the ‘No objection </w:t>
       </w:r>
@@ -2298,13 +2430,15 @@
         <w:spacing w:before="96" w:after="0" w:line="197" w:lineRule="auto"/>
         <w:rPr>
           <w:rFonts w:asciiTheme="majorBidi" w:hAnsiTheme="majorBidi" w:cstheme="majorBidi"/>
+          <w:sz w:val="20"/>
+          <w:szCs w:val="20"/>
         </w:rPr>
       </w:pPr>
       <w:r>
         <w:rPr>
           <w:rFonts w:asciiTheme="majorBidi" w:eastAsia="Calibri" w:hAnsiTheme="majorBidi" w:cstheme="majorBidi"/>
           <w:color w:val="000000"/>
-          <w:sz w:val="24"/>
+          <w:szCs w:val="20"/>
         </w:rPr>
         <w:t xml:space="preserve">Certificate’ or any other document as required, to the Indian Mission officials and to the </w:t>
       </w:r>
@@ -2316,13 +2450,15 @@
         <w:spacing w:before="98" w:after="0" w:line="197" w:lineRule="auto"/>
         <w:rPr>
           <w:rFonts w:asciiTheme="majorBidi" w:hAnsiTheme="majorBidi" w:cstheme="majorBidi"/>
+          <w:sz w:val="20"/>
+          <w:szCs w:val="20"/>
         </w:rPr>
       </w:pPr>
       <w:r>
         <w:rPr>
           <w:rFonts w:asciiTheme="majorBidi" w:eastAsia="Calibri" w:hAnsiTheme="majorBidi" w:cstheme="majorBidi"/>
           <w:color w:val="000000"/>
-          <w:sz w:val="24"/>
+          <w:szCs w:val="20"/>
         </w:rPr>
         <w:t xml:space="preserve">government of my country, to facilitate the exit of the Indian employee. </w:t>
       </w:r>
@@ -2334,13 +2470,15 @@
         <w:spacing w:before="98" w:after="0" w:line="197" w:lineRule="auto"/>
         <w:rPr>
           <w:rFonts w:asciiTheme="majorBidi" w:hAnsiTheme="majorBidi" w:cstheme="majorBidi"/>
+          <w:sz w:val="20"/>
+          <w:szCs w:val="20"/>
         </w:rPr>
       </w:pPr>
       <w:r>
         <w:rPr>
           <w:rFonts w:asciiTheme="majorBidi" w:eastAsia="Calibri" w:hAnsiTheme="majorBidi" w:cstheme="majorBidi"/>
           <w:color w:val="000000"/>
-          <w:sz w:val="24"/>
+          <w:szCs w:val="20"/>
         </w:rPr>
         <w:t xml:space="preserve">5.I undertake that I shall not withhold/ confiscate the passport, visa or the work permit </w:t>
       </w:r>
@@ -2352,13 +2490,15 @@
         <w:spacing w:before="100" w:after="0" w:line="197" w:lineRule="auto"/>
         <w:rPr>
           <w:rFonts w:asciiTheme="majorBidi" w:hAnsiTheme="majorBidi" w:cstheme="majorBidi"/>
+          <w:sz w:val="20"/>
+          <w:szCs w:val="20"/>
         </w:rPr>
       </w:pPr>
       <w:r>
         <w:rPr>
           <w:rFonts w:asciiTheme="majorBidi" w:eastAsia="Calibri" w:hAnsiTheme="majorBidi" w:cstheme="majorBidi"/>
           <w:color w:val="000000"/>
-          <w:sz w:val="24"/>
+          <w:szCs w:val="20"/>
         </w:rPr>
         <w:t xml:space="preserve">belonging to the Indian worker, under any circumstances. </w:t>
       </w:r>
@@ -2372,6 +2512,8 @@
         <w:jc w:val="right"/>
         <w:rPr>
           <w:rFonts w:asciiTheme="majorBidi" w:hAnsiTheme="majorBidi" w:cstheme="majorBidi"/>
+          <w:sz w:val="20"/>
+          <w:szCs w:val="20"/>
         </w:rPr>
         <w:sectPr>
           <w:footerReference w:type="default" r:id="rId8"/>
@@ -2385,27 +2527,9 @@
         <w:rPr>
           <w:rFonts w:asciiTheme="majorBidi" w:eastAsia="Calibri" w:hAnsiTheme="majorBidi" w:cstheme="majorBidi"/>
           <w:color w:val="000000"/>
-          <w:sz w:val="24"/>
-        </w:rPr>
-        <w:t>(</w:t>
-      </w:r>
-      <w:proofErr w:type="spellStart"/>
-      <w:r>
-        <w:rPr>
-          <w:rFonts w:asciiTheme="majorBidi" w:eastAsia="Calibri" w:hAnsiTheme="majorBidi" w:cstheme="majorBidi"/>
-          <w:color w:val="000000"/>
-          <w:sz w:val="24"/>
-        </w:rPr>
-        <w:t>Contd</w:t>
-      </w:r>
-      <w:proofErr w:type="spellEnd"/>
-      <w:r>
-        <w:rPr>
-          <w:rFonts w:asciiTheme="majorBidi" w:eastAsia="Calibri" w:hAnsiTheme="majorBidi" w:cstheme="majorBidi"/>
-          <w:color w:val="000000"/>
-          <w:sz w:val="24"/>
-        </w:rPr>
-        <w:t xml:space="preserve">) </w:t>
+          <w:szCs w:val="20"/>
+        </w:rPr>
+        <w:t xml:space="preserve">(Contd) </w:t>
       </w:r>
     </w:p>
     <w:p>
@@ -2416,13 +2540,15 @@
         <w:ind w:right="144"/>
         <w:rPr>
           <w:rFonts w:asciiTheme="majorBidi" w:hAnsiTheme="majorBidi" w:cstheme="majorBidi"/>
+          <w:sz w:val="20"/>
+          <w:szCs w:val="20"/>
         </w:rPr>
       </w:pPr>
       <w:r>
         <w:rPr>
           <w:rFonts w:asciiTheme="majorBidi" w:eastAsia="Calibri" w:hAnsiTheme="majorBidi" w:cstheme="majorBidi"/>
           <w:color w:val="000000"/>
-          <w:sz w:val="24"/>
+          <w:szCs w:val="20"/>
         </w:rPr>
         <w:lastRenderedPageBreak/>
         <w:t xml:space="preserve">6.I undertake that I shall not falsely implicate any Indian worker and/ or shall not register any false case with any govt. agency or the police against the Indian worker. </w:t>
@@ -2436,6 +2562,8 @@
         <w:ind w:left="2" w:right="432"/>
         <w:rPr>
           <w:rFonts w:asciiTheme="majorBidi" w:hAnsiTheme="majorBidi" w:cstheme="majorBidi"/>
+          <w:sz w:val="20"/>
+          <w:szCs w:val="20"/>
         </w:rPr>
       </w:pPr>
       <w:r>
@@ -2443,12 +2571,12 @@
           <w:rFonts w:asciiTheme="majorBidi" w:eastAsia="ArialMT" w:hAnsiTheme="majorBidi" w:cstheme="majorBidi"/>
           <w:noProof/>
           <w:color w:val="000000"/>
-          <w:sz w:val="24"/>
+          <w:szCs w:val="20"/>
         </w:rPr>
         <mc:AlternateContent>
           <mc:Choice Requires="wps">
             <w:drawing>
-              <wp:anchor distT="0" distB="0" distL="114300" distR="114300" simplePos="0" relativeHeight="251659264" behindDoc="0" locked="0" layoutInCell="1" allowOverlap="1" wp14:anchorId="002C4F2D" wp14:editId="3B1BEAEC">
+              <wp:anchor distT="0" distB="0" distL="114300" distR="114300" simplePos="0" relativeHeight="251660288" behindDoc="0" locked="0" layoutInCell="1" allowOverlap="1" wp14:anchorId="002C4F2D" wp14:editId="3B1BEAEC">
                 <wp:simplePos x="0" y="0"/>
                 <wp:positionH relativeFrom="column">
                   <wp:posOffset>4166870</wp:posOffset>
@@ -2534,7 +2662,7 @@
           </mc:Choice>
           <mc:Fallback>
             <w:pict>
-              <v:rect w14:anchorId="002C4F2D" id="Rectangle 16" o:spid="_x0000_s1033" style="position:absolute;left:0;text-align:left;margin-left:328.1pt;margin-top:56.35pt;width:109.5pt;height:52pt;z-index:251659264;visibility:visible;mso-wrap-style:square;mso-width-percent:0;mso-height-percent:0;mso-wrap-distance-left:9pt;mso-wrap-distance-top:0;mso-wrap-distance-right:9pt;mso-wrap-distance-bottom:0;mso-position-horizontal:absolute;mso-position-horizontal-relative:text;mso-position-vertical:absolute;mso-position-vertical-relative:text;mso-width-percent:0;mso-height-percent:0;mso-width-relative:page;mso-height-relative:page;v-text-anchor:top" o:gfxdata="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" fillcolor="#4f81bd [3204]" stroked="f">
+              <v:rect w14:anchorId="002C4F2D" id="Rectangle 16" o:spid="_x0000_s1033" style="position:absolute;left:0;text-align:left;margin-left:328.1pt;margin-top:56.35pt;width:109.5pt;height:52pt;z-index:251660288;visibility:visible;mso-wrap-style:square;mso-width-percent:0;mso-height-percent:0;mso-wrap-distance-left:9pt;mso-wrap-distance-top:0;mso-wrap-distance-right:9pt;mso-wrap-distance-bottom:0;mso-position-horizontal:absolute;mso-position-horizontal-relative:text;mso-position-vertical:absolute;mso-position-vertical-relative:text;mso-width-percent:0;mso-height-percent:0;mso-width-relative:page;mso-height-relative:page;v-text-anchor:top" o:gfxdata="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" fillcolor="#4f81bd [3204]" stroked="f">
                 <v:textbox>
                   <w:txbxContent>
                     <w:p>
@@ -2563,12 +2691,12 @@
           <w:rFonts w:asciiTheme="majorBidi" w:eastAsia="ArialMT" w:hAnsiTheme="majorBidi" w:cstheme="majorBidi"/>
           <w:noProof/>
           <w:color w:val="000000"/>
-          <w:sz w:val="24"/>
+          <w:szCs w:val="20"/>
         </w:rPr>
         <mc:AlternateContent>
           <mc:Choice Requires="wps">
             <w:drawing>
-              <wp:anchor distT="0" distB="0" distL="114300" distR="114300" simplePos="0" relativeHeight="251656192" behindDoc="0" locked="0" layoutInCell="1" allowOverlap="1" wp14:anchorId="74D0C93B" wp14:editId="24E02B34">
+              <wp:anchor distT="0" distB="0" distL="114300" distR="114300" simplePos="0" relativeHeight="251657216" behindDoc="0" locked="0" layoutInCell="1" allowOverlap="1" wp14:anchorId="74D0C93B" wp14:editId="24E02B34">
                 <wp:simplePos x="0" y="0"/>
                 <wp:positionH relativeFrom="column">
                   <wp:posOffset>4102100</wp:posOffset>
@@ -2645,7 +2773,7 @@
           </mc:Choice>
           <mc:Fallback>
             <w:pict>
-              <v:rect w14:anchorId="74D0C93B" id="Rectangle 15" o:spid="_x0000_s1034" style="position:absolute;left:0;text-align:left;margin-left:323pt;margin-top:52.55pt;width:119.5pt;height:58.6pt;z-index:251656192;visibility:visible;mso-wrap-style:square;mso-width-percent:0;mso-height-percent:0;mso-wrap-distance-left:9pt;mso-wrap-distance-top:0;mso-wrap-distance-right:9pt;mso-wrap-distance-bottom:0;mso-position-horizontal:absolute;mso-position-horizontal-relative:text;mso-position-vertical:absolute;mso-position-vertical-relative:text;mso-width-percent:0;mso-height-percent:0;mso-width-relative:page;mso-height-relative:page;v-text-anchor:top" o:gfxdata="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">
+              <v:rect w14:anchorId="74D0C93B" id="Rectangle 15" o:spid="_x0000_s1034" style="position:absolute;left:0;text-align:left;margin-left:323pt;margin-top:52.55pt;width:119.5pt;height:58.6pt;z-index:251657216;visibility:visible;mso-wrap-style:square;mso-width-percent:0;mso-height-percent:0;mso-wrap-distance-left:9pt;mso-wrap-distance-top:0;mso-wrap-distance-right:9pt;mso-wrap-distance-bottom:0;mso-position-horizontal:absolute;mso-position-horizontal-relative:text;mso-position-vertical:absolute;mso-position-vertical-relative:text;mso-width-percent:0;mso-height-percent:0;mso-width-relative:page;mso-height-relative:page;v-text-anchor:top" o:gfxdata="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">
                 <v:textbox>
                   <w:txbxContent>
                     <w:p>
@@ -2674,7 +2802,7 @@
         <w:rPr>
           <w:rFonts w:asciiTheme="majorBidi" w:eastAsia="Calibri" w:hAnsiTheme="majorBidi" w:cstheme="majorBidi"/>
           <w:color w:val="000000"/>
-          <w:sz w:val="24"/>
+          <w:szCs w:val="20"/>
         </w:rPr>
         <w:t xml:space="preserve">7.I undertake that once FE registration application submitted by me is approved, I shall not apply for the registration of the same organization again under any circumstances. </w:t>
       </w:r>
@@ -2683,6 +2811,8 @@
       <w:pPr>
         <w:rPr>
           <w:rFonts w:asciiTheme="majorBidi" w:hAnsiTheme="majorBidi" w:cstheme="majorBidi"/>
+          <w:sz w:val="20"/>
+          <w:szCs w:val="20"/>
         </w:rPr>
         <w:sectPr>
           <w:pgSz w:w="12240" w:h="15840"/>
@@ -2704,12 +2834,14 @@
         <w:rPr>
           <w:rFonts w:asciiTheme="majorBidi" w:eastAsia="ArialMT" w:hAnsiTheme="majorBidi" w:cstheme="majorBidi"/>
           <w:color w:val="000000"/>
-          <w:sz w:val="24"/>
+          <w:szCs w:val="20"/>
         </w:rPr>
       </w:pPr>
       <w:r>
         <w:rPr>
           <w:rFonts w:asciiTheme="majorBidi" w:hAnsiTheme="majorBidi" w:cstheme="majorBidi"/>
+          <w:sz w:val="20"/>
+          <w:szCs w:val="20"/>
         </w:rPr>
         <w:tab/>
       </w:r>
@@ -2717,7 +2849,7 @@
         <w:rPr>
           <w:rFonts w:asciiTheme="majorBidi" w:eastAsia="ArialMT" w:hAnsiTheme="majorBidi" w:cstheme="majorBidi"/>
           <w:color w:val="000000"/>
-          <w:sz w:val="24"/>
+          <w:szCs w:val="20"/>
         </w:rPr>
         <w:t xml:space="preserve"> </w:t>
       </w:r>
@@ -2734,7 +2866,7 @@
         <w:rPr>
           <w:rFonts w:asciiTheme="majorBidi" w:eastAsia="ArialMT" w:hAnsiTheme="majorBidi" w:cstheme="majorBidi"/>
           <w:color w:val="000000"/>
-          <w:sz w:val="24"/>
+          <w:szCs w:val="20"/>
         </w:rPr>
       </w:pPr>
     </w:p>
@@ -2749,14 +2881,16 @@
         <w:ind w:left="2" w:right="432"/>
         <w:rPr>
           <w:rFonts w:asciiTheme="majorBidi" w:hAnsiTheme="majorBidi" w:cstheme="majorBidi"/>
+          <w:sz w:val="20"/>
+          <w:szCs w:val="20"/>
         </w:rPr>
       </w:pPr>
       <w:r>
         <w:rPr>
           <w:rFonts w:asciiTheme="majorBidi" w:eastAsia="ArialMT" w:hAnsiTheme="majorBidi" w:cstheme="majorBidi"/>
           <w:color w:val="000000"/>
-          <w:sz w:val="20"/>
-          <w:szCs w:val="20"/>
+          <w:sz w:val="18"/>
+          <w:szCs w:val="18"/>
         </w:rPr>
         <w:t xml:space="preserve">           </w:t>
       </w:r>
@@ -2764,8 +2898,8 @@
         <w:rPr>
           <w:rFonts w:asciiTheme="majorBidi" w:eastAsia="ArialMT" w:hAnsiTheme="majorBidi" w:cstheme="majorBidi"/>
           <w:color w:val="000000"/>
-          <w:sz w:val="20"/>
-          <w:szCs w:val="20"/>
+          <w:sz w:val="18"/>
+          <w:szCs w:val="18"/>
         </w:rPr>
         <w:tab/>
       </w:r>
@@ -2782,15 +2916,17 @@
         <w:rPr>
           <w:rFonts w:asciiTheme="majorBidi" w:eastAsia="Calibri" w:hAnsiTheme="majorBidi" w:cstheme="majorBidi"/>
           <w:color w:val="000000"/>
-          <w:sz w:val="24"/>
+          <w:szCs w:val="20"/>
         </w:rPr>
       </w:pPr>
       <w:r>
         <w:rPr>
           <w:noProof/>
+          <w:sz w:val="20"/>
+          <w:szCs w:val="20"/>
         </w:rPr>
         <w:drawing>
-          <wp:anchor distT="0" distB="0" distL="114300" distR="114300" simplePos="0" relativeHeight="251661312" behindDoc="1" locked="1" layoutInCell="1" allowOverlap="1" wp14:anchorId="473B6BF8" wp14:editId="5EC8E653">
+          <wp:anchor distT="0" distB="0" distL="114300" distR="114300" simplePos="0" relativeHeight="251662336" behindDoc="1" locked="1" layoutInCell="1" allowOverlap="1" wp14:anchorId="473B6BF8" wp14:editId="5EC8E653">
             <wp:simplePos x="0" y="0"/>
             <wp:positionH relativeFrom="column">
               <wp:posOffset>2444750</wp:posOffset>
@@ -2850,6 +2986,8 @@
         <w:rPr>
           <w:rFonts w:asciiTheme="majorBidi" w:eastAsia="Calibri" w:hAnsiTheme="majorBidi" w:cstheme="majorBidi"/>
           <w:color w:val="000000"/>
+          <w:sz w:val="20"/>
+          <w:szCs w:val="20"/>
         </w:rPr>
         <w:t>Dat</w:t>
       </w:r>
@@ -2857,6 +2995,8 @@
         <w:rPr>
           <w:rFonts w:asciiTheme="majorBidi" w:eastAsia="Calibri" w:hAnsiTheme="majorBidi" w:cstheme="majorBidi"/>
           <w:color w:val="000000"/>
+          <w:sz w:val="20"/>
+          <w:szCs w:val="20"/>
         </w:rPr>
         <w:t xml:space="preserve">e </w:t>
       </w:r>
@@ -2864,8 +3004,6 @@
         <w:rPr>
           <w:rFonts w:asciiTheme="majorBidi" w:eastAsia="ArialMT" w:hAnsiTheme="majorBidi" w:cstheme="majorBidi"/>
           <w:color w:val="000000"/>
-          <w:sz w:val="24"/>
-          <w:szCs w:val="24"/>
           <w:u w:val="dottedHeavy"/>
         </w:rPr>
         <w:t>{{</w:t>
@@ -2874,8 +3012,8 @@
         <w:rPr>
           <w:rFonts w:asciiTheme="majorBidi" w:eastAsia="ArialMT" w:hAnsiTheme="majorBidi" w:cstheme="majorBidi"/>
           <w:color w:val="000000"/>
-          <w:sz w:val="18"/>
-          <w:szCs w:val="18"/>
+          <w:sz w:val="16"/>
+          <w:szCs w:val="16"/>
           <w:u w:val="dottedHeavy"/>
         </w:rPr>
         <w:t>VISAISSUEDATE</w:t>
@@ -2884,8 +3022,6 @@
         <w:rPr>
           <w:rFonts w:asciiTheme="majorBidi" w:eastAsia="ArialMT" w:hAnsiTheme="majorBidi" w:cstheme="majorBidi"/>
           <w:color w:val="000000"/>
-          <w:sz w:val="24"/>
-          <w:szCs w:val="24"/>
           <w:u w:val="dottedHeavy"/>
         </w:rPr>
         <w:t>}}</w:t>
@@ -2894,7 +3030,7 @@
         <w:rPr>
           <w:rFonts w:asciiTheme="majorBidi" w:eastAsia="Calibri" w:hAnsiTheme="majorBidi" w:cstheme="majorBidi"/>
           <w:color w:val="000000"/>
-          <w:sz w:val="24"/>
+          <w:szCs w:val="20"/>
         </w:rPr>
         <w:t>.</w:t>
       </w:r>
@@ -2911,7 +3047,7 @@
         <w:rPr>
           <w:rFonts w:asciiTheme="majorBidi" w:eastAsia="Calibri" w:hAnsiTheme="majorBidi" w:cstheme="majorBidi"/>
           <w:color w:val="000000"/>
-          <w:sz w:val="24"/>
+          <w:szCs w:val="20"/>
         </w:rPr>
       </w:pPr>
     </w:p>
@@ -2927,14 +3063,14 @@
         <w:rPr>
           <w:rFonts w:asciiTheme="majorBidi" w:eastAsia="Calibri" w:hAnsiTheme="majorBidi" w:cstheme="majorBidi"/>
           <w:color w:val="000000"/>
-          <w:sz w:val="24"/>
+          <w:szCs w:val="20"/>
         </w:rPr>
       </w:pPr>
       <w:r>
         <w:rPr>
           <w:rFonts w:asciiTheme="majorBidi" w:eastAsia="Calibri" w:hAnsiTheme="majorBidi" w:cstheme="majorBidi"/>
           <w:color w:val="000000"/>
-          <w:sz w:val="24"/>
+          <w:szCs w:val="20"/>
         </w:rPr>
         <w:tab/>
       </w:r>
@@ -2942,7 +3078,7 @@
         <w:rPr>
           <w:rFonts w:asciiTheme="majorBidi" w:eastAsia="Calibri" w:hAnsiTheme="majorBidi" w:cstheme="majorBidi"/>
           <w:color w:val="000000"/>
-          <w:sz w:val="24"/>
+          <w:szCs w:val="20"/>
         </w:rPr>
         <w:tab/>
       </w:r>
@@ -2950,7 +3086,7 @@
         <w:rPr>
           <w:rFonts w:asciiTheme="majorBidi" w:eastAsia="Calibri" w:hAnsiTheme="majorBidi" w:cstheme="majorBidi"/>
           <w:color w:val="000000"/>
-          <w:sz w:val="24"/>
+          <w:szCs w:val="20"/>
         </w:rPr>
         <w:tab/>
       </w:r>
@@ -2958,7 +3094,7 @@
         <w:rPr>
           <w:rFonts w:asciiTheme="majorBidi" w:eastAsia="Calibri" w:hAnsiTheme="majorBidi" w:cstheme="majorBidi"/>
           <w:color w:val="000000"/>
-          <w:sz w:val="24"/>
+          <w:szCs w:val="20"/>
         </w:rPr>
         <w:tab/>
       </w:r>
@@ -2966,7 +3102,7 @@
         <w:rPr>
           <w:rFonts w:asciiTheme="majorBidi" w:eastAsia="Calibri" w:hAnsiTheme="majorBidi" w:cstheme="majorBidi"/>
           <w:color w:val="000000"/>
-          <w:sz w:val="24"/>
+          <w:szCs w:val="20"/>
         </w:rPr>
         <w:tab/>
       </w:r>
@@ -2974,7 +3110,7 @@
         <w:rPr>
           <w:rFonts w:asciiTheme="majorBidi" w:eastAsia="Calibri" w:hAnsiTheme="majorBidi" w:cstheme="majorBidi"/>
           <w:color w:val="000000"/>
-          <w:sz w:val="24"/>
+          <w:szCs w:val="20"/>
         </w:rPr>
         <w:tab/>
       </w:r>
@@ -2982,7 +3118,7 @@
         <w:rPr>
           <w:rFonts w:asciiTheme="majorBidi" w:eastAsia="Calibri" w:hAnsiTheme="majorBidi" w:cstheme="majorBidi"/>
           <w:color w:val="000000"/>
-          <w:sz w:val="24"/>
+          <w:szCs w:val="20"/>
         </w:rPr>
         <w:tab/>
       </w:r>
@@ -2990,7 +3126,7 @@
         <w:rPr>
           <w:rFonts w:asciiTheme="majorBidi" w:eastAsia="Calibri" w:hAnsiTheme="majorBidi" w:cstheme="majorBidi"/>
           <w:color w:val="000000"/>
-          <w:sz w:val="24"/>
+          <w:szCs w:val="20"/>
         </w:rPr>
         <w:tab/>
       </w:r>
@@ -2998,7 +3134,7 @@
         <w:rPr>
           <w:rFonts w:asciiTheme="majorBidi" w:eastAsia="Calibri" w:hAnsiTheme="majorBidi" w:cstheme="majorBidi"/>
           <w:color w:val="000000"/>
-          <w:sz w:val="24"/>
+          <w:szCs w:val="20"/>
         </w:rPr>
         <w:tab/>
       </w:r>
@@ -3006,7 +3142,7 @@
         <w:rPr>
           <w:rFonts w:asciiTheme="majorBidi" w:eastAsia="Calibri" w:hAnsiTheme="majorBidi" w:cstheme="majorBidi"/>
           <w:color w:val="000000"/>
-          <w:sz w:val="24"/>
+          <w:szCs w:val="20"/>
         </w:rPr>
         <w:tab/>
       </w:r>
@@ -3014,7 +3150,7 @@
         <w:rPr>
           <w:rFonts w:asciiTheme="majorBidi" w:eastAsia="Calibri" w:hAnsiTheme="majorBidi" w:cstheme="majorBidi"/>
           <w:color w:val="000000"/>
-          <w:sz w:val="24"/>
+          <w:szCs w:val="20"/>
           <w:u w:val="dottedHeavy"/>
         </w:rPr>
         <w:t xml:space="preserve">+{{PHONENO}}      </w:t>
@@ -3023,7 +3159,7 @@
         <w:rPr>
           <w:rFonts w:asciiTheme="majorBidi" w:eastAsia="Calibri" w:hAnsiTheme="majorBidi" w:cstheme="majorBidi"/>
           <w:color w:val="000000"/>
-          <w:sz w:val="24"/>
+          <w:szCs w:val="20"/>
           <w:u w:val="dotted"/>
         </w:rPr>
         <w:t xml:space="preserve">         </w:t>
@@ -3041,7 +3177,7 @@
         <w:rPr>
           <w:rFonts w:asciiTheme="majorBidi" w:eastAsia="Calibri" w:hAnsiTheme="majorBidi" w:cstheme="majorBidi"/>
           <w:color w:val="000000"/>
-          <w:sz w:val="24"/>
+          <w:szCs w:val="20"/>
         </w:rPr>
       </w:pPr>
     </w:p>
@@ -3057,7 +3193,7 @@
         <w:rPr>
           <w:rFonts w:asciiTheme="majorBidi" w:eastAsia="Calibri" w:hAnsiTheme="majorBidi" w:cstheme="majorBidi"/>
           <w:color w:val="000000"/>
-          <w:sz w:val="24"/>
+          <w:szCs w:val="20"/>
         </w:rPr>
       </w:pPr>
     </w:p>
@@ -3073,7 +3209,7 @@
         <w:rPr>
           <w:rFonts w:asciiTheme="majorBidi" w:eastAsia="Calibri" w:hAnsiTheme="majorBidi" w:cstheme="majorBidi"/>
           <w:color w:val="000000"/>
-          <w:sz w:val="24"/>
+          <w:szCs w:val="20"/>
         </w:rPr>
       </w:pPr>
     </w:p>
@@ -3091,7 +3227,7 @@
           <w:b/>
           <w:bCs/>
           <w:color w:val="000000"/>
-          <w:sz w:val="24"/>
+          <w:szCs w:val="20"/>
         </w:rPr>
       </w:pPr>
       <w:r>
@@ -3100,7 +3236,7 @@
           <w:b/>
           <w:bCs/>
           <w:color w:val="000000"/>
-          <w:sz w:val="24"/>
+          <w:szCs w:val="20"/>
         </w:rPr>
         <w:t>Important Notes:</w:t>
       </w:r>
@@ -3115,14 +3251,14 @@
         <w:rPr>
           <w:rFonts w:asciiTheme="majorBidi" w:eastAsia="Calibri" w:hAnsiTheme="majorBidi" w:cstheme="majorBidi"/>
           <w:color w:val="000000"/>
-          <w:sz w:val="24"/>
+          <w:szCs w:val="20"/>
         </w:rPr>
       </w:pPr>
       <w:r>
         <w:rPr>
           <w:rFonts w:asciiTheme="majorBidi" w:eastAsia="Calibri" w:hAnsiTheme="majorBidi" w:cstheme="majorBidi"/>
           <w:color w:val="000000"/>
-          <w:sz w:val="24"/>
+          <w:szCs w:val="20"/>
         </w:rPr>
         <w:t xml:space="preserve">1.This Request letter is required to be downloaded by the Employer from </w:t>
       </w:r>
@@ -3131,7 +3267,7 @@
         <w:rPr>
           <w:rFonts w:asciiTheme="majorBidi" w:eastAsia="Calibri" w:hAnsiTheme="majorBidi" w:cstheme="majorBidi"/>
           <w:color w:val="000000"/>
-          <w:sz w:val="24"/>
+          <w:szCs w:val="20"/>
         </w:rPr>
         <w:t>eMigrate</w:t>
       </w:r>
@@ -3140,7 +3276,7 @@
         <w:rPr>
           <w:rFonts w:asciiTheme="majorBidi" w:eastAsia="Calibri" w:hAnsiTheme="majorBidi" w:cstheme="majorBidi"/>
           <w:color w:val="000000"/>
-          <w:sz w:val="24"/>
+          <w:szCs w:val="20"/>
         </w:rPr>
         <w:t xml:space="preserve"> website and</w:t>
       </w:r>
@@ -3155,14 +3291,14 @@
         <w:rPr>
           <w:rFonts w:asciiTheme="majorBidi" w:eastAsia="Calibri" w:hAnsiTheme="majorBidi" w:cstheme="majorBidi"/>
           <w:color w:val="000000"/>
-          <w:sz w:val="24"/>
+          <w:szCs w:val="20"/>
         </w:rPr>
       </w:pPr>
       <w:r>
         <w:rPr>
           <w:rFonts w:asciiTheme="majorBidi" w:eastAsia="Calibri" w:hAnsiTheme="majorBidi" w:cstheme="majorBidi"/>
           <w:color w:val="000000"/>
-          <w:sz w:val="24"/>
+          <w:szCs w:val="20"/>
         </w:rPr>
         <w:t>filled-in completely with required information and signature etc. before start applying online for</w:t>
       </w:r>
@@ -3176,13 +3312,15 @@
         <w:jc w:val="both"/>
         <w:rPr>
           <w:rFonts w:asciiTheme="majorBidi" w:hAnsiTheme="majorBidi" w:cstheme="majorBidi"/>
+          <w:sz w:val="20"/>
+          <w:szCs w:val="20"/>
         </w:rPr>
       </w:pPr>
       <w:r>
         <w:rPr>
           <w:rFonts w:asciiTheme="majorBidi" w:eastAsia="Calibri" w:hAnsiTheme="majorBidi" w:cstheme="majorBidi"/>
           <w:color w:val="000000"/>
-          <w:sz w:val="24"/>
+          <w:szCs w:val="20"/>
         </w:rPr>
         <w:t xml:space="preserve">FE Registration on </w:t>
       </w:r>
@@ -3191,7 +3329,7 @@
         <w:rPr>
           <w:rFonts w:asciiTheme="majorBidi" w:eastAsia="Calibri" w:hAnsiTheme="majorBidi" w:cstheme="majorBidi"/>
           <w:color w:val="000000"/>
-          <w:sz w:val="24"/>
+          <w:szCs w:val="20"/>
         </w:rPr>
         <w:t>eMigrate</w:t>
       </w:r>
@@ -3200,7 +3338,7 @@
         <w:rPr>
           <w:rFonts w:asciiTheme="majorBidi" w:eastAsia="Calibri" w:hAnsiTheme="majorBidi" w:cstheme="majorBidi"/>
           <w:color w:val="000000"/>
-          <w:sz w:val="24"/>
+          <w:szCs w:val="20"/>
         </w:rPr>
         <w:t xml:space="preserve">. </w:t>
       </w:r>
@@ -3216,13 +3354,15 @@
         <w:ind w:left="2"/>
         <w:rPr>
           <w:rFonts w:asciiTheme="majorBidi" w:hAnsiTheme="majorBidi" w:cstheme="majorBidi"/>
+          <w:sz w:val="20"/>
+          <w:szCs w:val="20"/>
         </w:rPr>
       </w:pPr>
       <w:r>
         <w:rPr>
           <w:rFonts w:asciiTheme="majorBidi" w:eastAsia="Calibri" w:hAnsiTheme="majorBidi" w:cstheme="majorBidi"/>
           <w:color w:val="000000"/>
-          <w:sz w:val="24"/>
+          <w:szCs w:val="20"/>
         </w:rPr>
         <w:t xml:space="preserve">2.The completely filled in Request Letter is required to be uploaded by the Employer along with the other supporting document, at the time of online application. </w:t>
       </w:r>
@@ -3238,13 +3378,15 @@
         <w:ind w:left="2"/>
         <w:rPr>
           <w:rFonts w:asciiTheme="majorBidi" w:hAnsiTheme="majorBidi" w:cstheme="majorBidi"/>
+          <w:sz w:val="20"/>
+          <w:szCs w:val="20"/>
         </w:rPr>
       </w:pPr>
       <w:r>
         <w:rPr>
           <w:rFonts w:asciiTheme="majorBidi" w:eastAsia="Calibri" w:hAnsiTheme="majorBidi" w:cstheme="majorBidi"/>
           <w:color w:val="000000"/>
-          <w:sz w:val="24"/>
+          <w:szCs w:val="20"/>
         </w:rPr>
         <w:t xml:space="preserve">3.Employer is required to mention the date and sign both the pages of this Request letter as indicated. </w:t>
       </w:r>
@@ -3259,14 +3401,14 @@
         <w:rPr>
           <w:rFonts w:asciiTheme="majorBidi" w:eastAsia="Calibri" w:hAnsiTheme="majorBidi" w:cstheme="majorBidi"/>
           <w:color w:val="000000"/>
-          <w:sz w:val="24"/>
+          <w:szCs w:val="20"/>
         </w:rPr>
       </w:pPr>
       <w:r>
         <w:rPr>
           <w:rFonts w:asciiTheme="majorBidi" w:eastAsia="Calibri" w:hAnsiTheme="majorBidi" w:cstheme="majorBidi"/>
           <w:color w:val="000000"/>
-          <w:sz w:val="24"/>
+          <w:szCs w:val="20"/>
         </w:rPr>
         <w:t>4.This Request Letter must be filled-in completely and in English Language only. In case the</w:t>
       </w:r>
@@ -3281,14 +3423,14 @@
         <w:rPr>
           <w:rFonts w:asciiTheme="majorBidi" w:eastAsia="Calibri" w:hAnsiTheme="majorBidi" w:cstheme="majorBidi"/>
           <w:color w:val="000000"/>
-          <w:sz w:val="24"/>
+          <w:szCs w:val="20"/>
         </w:rPr>
       </w:pPr>
       <w:r>
         <w:rPr>
           <w:rFonts w:asciiTheme="majorBidi" w:eastAsia="Calibri" w:hAnsiTheme="majorBidi" w:cstheme="majorBidi"/>
           <w:color w:val="000000"/>
-          <w:sz w:val="24"/>
+          <w:szCs w:val="20"/>
         </w:rPr>
         <w:t>form is not filed completely or filled-in any language other than English, the Indian Mission</w:t>
       </w:r>
@@ -3303,14 +3445,14 @@
         <w:rPr>
           <w:rFonts w:asciiTheme="majorBidi" w:eastAsia="Calibri" w:hAnsiTheme="majorBidi" w:cstheme="majorBidi"/>
           <w:color w:val="000000"/>
-          <w:sz w:val="24"/>
+          <w:szCs w:val="20"/>
         </w:rPr>
       </w:pPr>
       <w:r>
         <w:rPr>
           <w:rFonts w:asciiTheme="majorBidi" w:eastAsia="Calibri" w:hAnsiTheme="majorBidi" w:cstheme="majorBidi"/>
           <w:color w:val="000000"/>
-          <w:sz w:val="24"/>
+          <w:szCs w:val="20"/>
         </w:rPr>
         <w:t>officer, processing the FE registration application is directed to summarily reject the application</w:t>
       </w:r>
@@ -3324,13 +3466,15 @@
         <w:jc w:val="both"/>
         <w:rPr>
           <w:rFonts w:asciiTheme="majorBidi" w:hAnsiTheme="majorBidi" w:cstheme="majorBidi"/>
+          <w:sz w:val="20"/>
+          <w:szCs w:val="20"/>
         </w:rPr>
       </w:pPr>
       <w:r>
         <w:rPr>
           <w:rFonts w:asciiTheme="majorBidi" w:eastAsia="Calibri" w:hAnsiTheme="majorBidi" w:cstheme="majorBidi"/>
           <w:color w:val="000000"/>
-          <w:sz w:val="24"/>
+          <w:szCs w:val="20"/>
         </w:rPr>
         <w:t xml:space="preserve">for FE Registration. </w:t>
       </w:r>
@@ -3342,13 +3486,15 @@
         <w:spacing w:before="52" w:after="0" w:line="197" w:lineRule="auto"/>
         <w:rPr>
           <w:rFonts w:asciiTheme="majorBidi" w:hAnsiTheme="majorBidi" w:cstheme="majorBidi"/>
+          <w:sz w:val="20"/>
+          <w:szCs w:val="20"/>
         </w:rPr>
       </w:pPr>
       <w:r>
         <w:rPr>
           <w:rFonts w:asciiTheme="majorBidi" w:eastAsia="Calibri" w:hAnsiTheme="majorBidi" w:cstheme="majorBidi"/>
           <w:color w:val="000000"/>
-          <w:sz w:val="24"/>
+          <w:szCs w:val="20"/>
         </w:rPr>
         <w:t xml:space="preserve">5.The content of this Request Letter shall not be altered or modified under any circumstance. </w:t>
       </w:r>
@@ -3360,13 +3506,15 @@
         <w:spacing w:before="54" w:after="0" w:line="245" w:lineRule="auto"/>
         <w:rPr>
           <w:rFonts w:asciiTheme="majorBidi" w:hAnsiTheme="majorBidi" w:cstheme="majorBidi"/>
+          <w:sz w:val="20"/>
+          <w:szCs w:val="20"/>
         </w:rPr>
       </w:pPr>
       <w:r>
         <w:rPr>
           <w:rFonts w:asciiTheme="majorBidi" w:eastAsia="Calibri" w:hAnsiTheme="majorBidi" w:cstheme="majorBidi"/>
           <w:color w:val="000000"/>
-          <w:sz w:val="24"/>
+          <w:szCs w:val="20"/>
         </w:rPr>
         <w:t xml:space="preserve">Application for FE Registration, with altered/ modified Request Letter shall be rejected summarily by the Indian Mission. </w:t>
       </w:r>
@@ -3379,6 +3527,8 @@
         <w:ind w:left="2" w:right="144"/>
         <w:rPr>
           <w:rFonts w:asciiTheme="majorBidi" w:hAnsiTheme="majorBidi" w:cstheme="majorBidi"/>
+          <w:sz w:val="20"/>
+          <w:szCs w:val="20"/>
         </w:rPr>
       </w:pPr>
       <w:r>
@@ -3386,7 +3536,7 @@
           <w:rFonts w:asciiTheme="majorBidi" w:eastAsia="Calibri" w:hAnsiTheme="majorBidi" w:cstheme="majorBidi"/>
           <w:b/>
           <w:color w:val="000000"/>
-          <w:sz w:val="24"/>
+          <w:szCs w:val="20"/>
         </w:rPr>
         <w:t xml:space="preserve">List of Documents uploaded on </w:t>
       </w:r>
@@ -3396,7 +3546,7 @@
           <w:rFonts w:asciiTheme="majorBidi" w:eastAsia="Calibri" w:hAnsiTheme="majorBidi" w:cstheme="majorBidi"/>
           <w:b/>
           <w:color w:val="000000"/>
-          <w:sz w:val="24"/>
+          <w:szCs w:val="20"/>
         </w:rPr>
         <w:t>eMigrate</w:t>
       </w:r>
@@ -3406,7 +3556,7 @@
           <w:rFonts w:asciiTheme="majorBidi" w:eastAsia="Calibri" w:hAnsiTheme="majorBidi" w:cstheme="majorBidi"/>
           <w:b/>
           <w:color w:val="000000"/>
-          <w:sz w:val="24"/>
+          <w:szCs w:val="20"/>
         </w:rPr>
         <w:t xml:space="preserve"> System along with FE Registration Application, are as under (Please tick box as applicable): </w:t>
       </w:r>
@@ -3440,13 +3590,15 @@
               <w:spacing w:before="152" w:after="0" w:line="197" w:lineRule="auto"/>
               <w:rPr>
                 <w:rFonts w:asciiTheme="majorBidi" w:hAnsiTheme="majorBidi" w:cstheme="majorBidi"/>
+                <w:sz w:val="20"/>
+                <w:szCs w:val="20"/>
               </w:rPr>
             </w:pPr>
             <w:r>
               <w:rPr>
                 <w:rFonts w:asciiTheme="majorBidi" w:eastAsia="Calibri" w:hAnsiTheme="majorBidi" w:cstheme="majorBidi"/>
                 <w:color w:val="000000"/>
-                <w:sz w:val="24"/>
+                <w:szCs w:val="20"/>
               </w:rPr>
               <w:t xml:space="preserve">1.Request Letter for FE Registration duly signed by Authorized Signatory/ individual </w:t>
             </w:r>
@@ -3469,12 +3621,16 @@
               <w:jc w:val="right"/>
               <w:rPr>
                 <w:rFonts w:asciiTheme="majorBidi" w:hAnsiTheme="majorBidi" w:cstheme="majorBidi"/>
+                <w:sz w:val="20"/>
+                <w:szCs w:val="20"/>
               </w:rPr>
             </w:pPr>
             <w:r>
               <w:rPr>
                 <w:rFonts w:asciiTheme="majorBidi" w:hAnsiTheme="majorBidi" w:cstheme="majorBidi"/>
                 <w:noProof/>
+                <w:sz w:val="20"/>
+                <w:szCs w:val="20"/>
               </w:rPr>
               <w:drawing>
                 <wp:inline distT="0" distB="0" distL="0" distR="0" wp14:anchorId="4A7F0B03" wp14:editId="06D63D8C">
@@ -3524,13 +3680,15 @@
         <w:ind w:left="218"/>
         <w:rPr>
           <w:rFonts w:asciiTheme="majorBidi" w:hAnsiTheme="majorBidi" w:cstheme="majorBidi"/>
+          <w:sz w:val="20"/>
+          <w:szCs w:val="20"/>
         </w:rPr>
       </w:pPr>
       <w:r>
         <w:rPr>
           <w:rFonts w:asciiTheme="majorBidi" w:eastAsia="Calibri" w:hAnsiTheme="majorBidi" w:cstheme="majorBidi"/>
           <w:color w:val="000000"/>
-          <w:sz w:val="24"/>
+          <w:szCs w:val="20"/>
         </w:rPr>
         <w:t xml:space="preserve">Employer. </w:t>
       </w:r>
@@ -3567,19 +3725,23 @@
               <w:spacing w:before="26" w:after="0" w:line="245" w:lineRule="auto"/>
               <w:rPr>
                 <w:rFonts w:asciiTheme="majorBidi" w:hAnsiTheme="majorBidi" w:cstheme="majorBidi"/>
+                <w:sz w:val="20"/>
+                <w:szCs w:val="20"/>
               </w:rPr>
             </w:pPr>
             <w:r>
               <w:rPr>
                 <w:rFonts w:asciiTheme="majorBidi" w:eastAsia="Calibri" w:hAnsiTheme="majorBidi" w:cstheme="majorBidi"/>
                 <w:color w:val="000000"/>
-                <w:sz w:val="24"/>
+                <w:szCs w:val="20"/>
               </w:rPr>
               <w:t xml:space="preserve">2.Copy of Passport / Personal Identification Number / Civil Id issued by Govt. Authority in the name of Authorized Signatory. </w:t>
             </w:r>
             <w:r>
               <w:rPr>
                 <w:rFonts w:asciiTheme="majorBidi" w:hAnsiTheme="majorBidi" w:cstheme="majorBidi"/>
+                <w:sz w:val="20"/>
+                <w:szCs w:val="20"/>
               </w:rPr>
               <w:br/>
             </w:r>
@@ -3587,7 +3749,7 @@
               <w:rPr>
                 <w:rFonts w:asciiTheme="majorBidi" w:eastAsia="Calibri" w:hAnsiTheme="majorBidi" w:cstheme="majorBidi"/>
                 <w:color w:val="000000"/>
-                <w:sz w:val="24"/>
+                <w:szCs w:val="20"/>
               </w:rPr>
               <w:t xml:space="preserve">3.Copy of Address proof. </w:t>
             </w:r>
@@ -3609,12 +3771,16 @@
               <w:jc w:val="center"/>
               <w:rPr>
                 <w:rFonts w:asciiTheme="majorBidi" w:hAnsiTheme="majorBidi" w:cstheme="majorBidi"/>
+                <w:sz w:val="20"/>
+                <w:szCs w:val="20"/>
               </w:rPr>
             </w:pPr>
             <w:r>
               <w:rPr>
                 <w:rFonts w:asciiTheme="majorBidi" w:hAnsiTheme="majorBidi" w:cstheme="majorBidi"/>
                 <w:noProof/>
+                <w:sz w:val="20"/>
+                <w:szCs w:val="20"/>
               </w:rPr>
               <w:drawing>
                 <wp:inline distT="0" distB="0" distL="0" distR="0" wp14:anchorId="6403D3F6" wp14:editId="01E775BD">
@@ -3661,12 +3827,16 @@
               <w:jc w:val="center"/>
               <w:rPr>
                 <w:rFonts w:asciiTheme="majorBidi" w:hAnsiTheme="majorBidi" w:cstheme="majorBidi"/>
+                <w:sz w:val="20"/>
+                <w:szCs w:val="20"/>
               </w:rPr>
             </w:pPr>
             <w:r>
               <w:rPr>
                 <w:rFonts w:asciiTheme="majorBidi" w:hAnsiTheme="majorBidi" w:cstheme="majorBidi"/>
                 <w:noProof/>
+                <w:sz w:val="20"/>
+                <w:szCs w:val="20"/>
               </w:rPr>
               <w:drawing>
                 <wp:inline distT="0" distB="0" distL="0" distR="0" wp14:anchorId="279C8052" wp14:editId="39F38729">
@@ -3715,6 +3885,8 @@
         <w:spacing w:before="514" w:after="0" w:line="197" w:lineRule="auto"/>
         <w:rPr>
           <w:rFonts w:asciiTheme="majorBidi" w:hAnsiTheme="majorBidi" w:cstheme="majorBidi"/>
+          <w:sz w:val="20"/>
+          <w:szCs w:val="20"/>
         </w:rPr>
       </w:pPr>
     </w:p>

</xml_diff>